<commit_message>
TSD: daftar 27 tabel, dan meluruskan applied_migrations
Namanya menjanjikan catatan migrasi; isinya satu penanda untuk satu
perbaikan data yang tidak boleh dijalankan dua kali. Membiarkan
namanya bicara sendiri akan menyesatkan orang berikutnya yang
mengandalkannya untuk tahu berkas mana yang sudah jalan.

Co-Authored-By: Claude Opus 5 <noreply@anthropic.com>
</commit_message>
<xml_diff>
--- a/docs/TSD-KAATAGO.docx
+++ b/docs/TSD-KAATAGO.docx
@@ -2225,7 +2225,1211 @@
         <w:rPr>
           <w:sz w:val="21"/>
         </w:rPr>
-        <w:t>27 tabel. Yang di bawah ini yang paling sering disentuh; sisanya pendukung.</w:t>
+        <w:t xml:space="preserve">27 tabel, seluruhnya di skema </w:t>
+      </w:r>
+      <w:r>
+        <w:rPr>
+          <w:rFonts w:ascii="Consolas" w:hAnsi="Consolas"/>
+          <w:color w:val="3730A3"/>
+          <w:sz w:val="21"/>
+        </w:rPr>
+        <w:t>public</w:t>
+      </w:r>
+      <w:r>
+        <w:rPr>
+          <w:sz w:val="21"/>
+        </w:rPr>
+        <w:t>.</w:t>
+      </w:r>
+    </w:p>
+    <w:p>
+      <w:pPr>
+        <w:pStyle w:val="Heading2"/>
+      </w:pPr>
+      <w:r>
+        <w:t>4.0 Daftar lengkap</w:t>
+      </w:r>
+    </w:p>
+    <w:tbl>
+      <w:tblPr>
+        <w:tblStyle w:val="TableGrid"/>
+        <w:tblW w:type="auto" w:w="0"/>
+        <w:tblLayout w:type="autofit"/>
+        <w:tblLook w:firstColumn="1" w:firstRow="1" w:lastColumn="0" w:lastRow="0" w:noHBand="0" w:noVBand="1" w:val="04A0"/>
+      </w:tblPr>
+      <w:tblGrid>
+        <w:gridCol w:w="4929"/>
+        <w:gridCol w:w="4929"/>
+      </w:tblGrid>
+      <w:tr>
+        <w:trPr>
+          <w:tblHeader w:val="true"/>
+        </w:trPr>
+        <w:tc>
+          <w:tcPr>
+            <w:tcW w:type="dxa" w:w="4929"/>
+            <w:shd w:val="clear" w:fill="4F46E5"/>
+          </w:tcPr>
+          <w:p>
+            <w:pPr>
+              <w:spacing w:after="40" w:before="40"/>
+            </w:pPr>
+            <w:r>
+              <w:rPr>
+                <w:b/>
+                <w:color w:val="FFFFFF"/>
+                <w:sz w:val="19"/>
+              </w:rPr>
+              <w:t>Tabel</w:t>
+            </w:r>
+          </w:p>
+        </w:tc>
+        <w:tc>
+          <w:tcPr>
+            <w:tcW w:type="dxa" w:w="4929"/>
+            <w:shd w:val="clear" w:fill="4F46E5"/>
+          </w:tcPr>
+          <w:p>
+            <w:pPr>
+              <w:spacing w:after="40" w:before="40"/>
+            </w:pPr>
+            <w:r>
+              <w:rPr>
+                <w:b/>
+                <w:color w:val="FFFFFF"/>
+                <w:sz w:val="19"/>
+              </w:rPr>
+              <w:t>Untuk apa</w:t>
+            </w:r>
+          </w:p>
+        </w:tc>
+      </w:tr>
+      <w:tr>
+        <w:tc>
+          <w:tcPr>
+            <w:tcW w:type="dxa" w:w="4929"/>
+          </w:tcPr>
+          <w:p>
+            <w:pPr>
+              <w:spacing w:after="40" w:before="40"/>
+            </w:pPr>
+            <w:r>
+              <w:rPr>
+                <w:rFonts w:ascii="Consolas" w:hAnsi="Consolas"/>
+                <w:color w:val="3730A3"/>
+                <w:sz w:val="19"/>
+              </w:rPr>
+              <w:t>restaurants</w:t>
+            </w:r>
+          </w:p>
+        </w:tc>
+        <w:tc>
+          <w:tcPr>
+            <w:tcW w:type="dxa" w:w="4929"/>
+          </w:tcPr>
+          <w:p>
+            <w:pPr>
+              <w:spacing w:after="40" w:before="40"/>
+            </w:pPr>
+            <w:r>
+              <w:rPr>
+                <w:sz w:val="19"/>
+              </w:rPr>
+              <w:t>Induk semuanya</w:t>
+            </w:r>
+          </w:p>
+        </w:tc>
+      </w:tr>
+      <w:tr>
+        <w:tc>
+          <w:tcPr>
+            <w:tcW w:type="dxa" w:w="4929"/>
+            <w:shd w:val="clear" w:fill="F4F5FB"/>
+          </w:tcPr>
+          <w:p>
+            <w:pPr>
+              <w:spacing w:after="40" w:before="40"/>
+            </w:pPr>
+            <w:r>
+              <w:rPr>
+                <w:rFonts w:ascii="Consolas" w:hAnsi="Consolas"/>
+                <w:color w:val="3730A3"/>
+                <w:sz w:val="19"/>
+              </w:rPr>
+              <w:t>employees</w:t>
+            </w:r>
+          </w:p>
+        </w:tc>
+        <w:tc>
+          <w:tcPr>
+            <w:tcW w:type="dxa" w:w="4929"/>
+            <w:shd w:val="clear" w:fill="F4F5FB"/>
+          </w:tcPr>
+          <w:p>
+            <w:pPr>
+              <w:spacing w:after="40" w:before="40"/>
+            </w:pPr>
+            <w:r>
+              <w:rPr>
+                <w:sz w:val="19"/>
+              </w:rPr>
+              <w:t>Karyawan berikut peran dan restonya</w:t>
+            </w:r>
+          </w:p>
+        </w:tc>
+      </w:tr>
+      <w:tr>
+        <w:tc>
+          <w:tcPr>
+            <w:tcW w:type="dxa" w:w="4929"/>
+          </w:tcPr>
+          <w:p>
+            <w:pPr>
+              <w:spacing w:after="40" w:before="40"/>
+            </w:pPr>
+            <w:r>
+              <w:rPr>
+                <w:rFonts w:ascii="Consolas" w:hAnsi="Consolas"/>
+                <w:color w:val="3730A3"/>
+                <w:sz w:val="19"/>
+              </w:rPr>
+              <w:t>customers</w:t>
+            </w:r>
+          </w:p>
+        </w:tc>
+        <w:tc>
+          <w:tcPr>
+            <w:tcW w:type="dxa" w:w="4929"/>
+          </w:tcPr>
+          <w:p>
+            <w:pPr>
+              <w:spacing w:after="40" w:before="40"/>
+            </w:pPr>
+            <w:r>
+              <w:rPr>
+                <w:sz w:val="19"/>
+              </w:rPr>
+              <w:t>Profil pelanggan yang punya akun</w:t>
+            </w:r>
+          </w:p>
+        </w:tc>
+      </w:tr>
+      <w:tr>
+        <w:tc>
+          <w:tcPr>
+            <w:tcW w:type="dxa" w:w="4929"/>
+            <w:shd w:val="clear" w:fill="F4F5FB"/>
+          </w:tcPr>
+          <w:p>
+            <w:pPr>
+              <w:spacing w:after="40" w:before="40"/>
+            </w:pPr>
+            <w:r>
+              <w:rPr>
+                <w:rFonts w:ascii="Consolas" w:hAnsi="Consolas"/>
+                <w:color w:val="3730A3"/>
+                <w:sz w:val="19"/>
+              </w:rPr>
+              <w:t>sessions</w:t>
+            </w:r>
+          </w:p>
+        </w:tc>
+        <w:tc>
+          <w:tcPr>
+            <w:tcW w:type="dxa" w:w="4929"/>
+            <w:shd w:val="clear" w:fill="F4F5FB"/>
+          </w:tcPr>
+          <w:p>
+            <w:pPr>
+              <w:spacing w:after="40" w:before="40"/>
+            </w:pPr>
+            <w:r>
+              <w:rPr>
+                <w:sz w:val="19"/>
+              </w:rPr>
+              <w:t>Sesi meja hasil pindai QR</w:t>
+            </w:r>
+          </w:p>
+        </w:tc>
+      </w:tr>
+      <w:tr>
+        <w:tc>
+          <w:tcPr>
+            <w:tcW w:type="dxa" w:w="4929"/>
+          </w:tcPr>
+          <w:p>
+            <w:pPr>
+              <w:spacing w:after="40" w:before="40"/>
+            </w:pPr>
+            <w:r>
+              <w:rPr>
+                <w:rFonts w:ascii="Consolas" w:hAnsi="Consolas"/>
+                <w:color w:val="3730A3"/>
+                <w:sz w:val="19"/>
+              </w:rPr>
+              <w:t>products</w:t>
+            </w:r>
+          </w:p>
+        </w:tc>
+        <w:tc>
+          <w:tcPr>
+            <w:tcW w:type="dxa" w:w="4929"/>
+          </w:tcPr>
+          <w:p>
+            <w:pPr>
+              <w:spacing w:after="40" w:before="40"/>
+            </w:pPr>
+            <w:r>
+              <w:rPr>
+                <w:sz w:val="19"/>
+              </w:rPr>
+              <w:t>Menu</w:t>
+            </w:r>
+          </w:p>
+        </w:tc>
+      </w:tr>
+      <w:tr>
+        <w:tc>
+          <w:tcPr>
+            <w:tcW w:type="dxa" w:w="4929"/>
+            <w:shd w:val="clear" w:fill="F4F5FB"/>
+          </w:tcPr>
+          <w:p>
+            <w:pPr>
+              <w:spacing w:after="40" w:before="40"/>
+            </w:pPr>
+            <w:r>
+              <w:rPr>
+                <w:rFonts w:ascii="Consolas" w:hAnsi="Consolas"/>
+                <w:color w:val="3730A3"/>
+                <w:sz w:val="19"/>
+              </w:rPr>
+              <w:t>categories</w:t>
+            </w:r>
+          </w:p>
+        </w:tc>
+        <w:tc>
+          <w:tcPr>
+            <w:tcW w:type="dxa" w:w="4929"/>
+            <w:shd w:val="clear" w:fill="F4F5FB"/>
+          </w:tcPr>
+          <w:p>
+            <w:pPr>
+              <w:spacing w:after="40" w:before="40"/>
+            </w:pPr>
+            <w:r>
+              <w:rPr>
+                <w:sz w:val="19"/>
+              </w:rPr>
+              <w:t>Kategori menu</w:t>
+            </w:r>
+          </w:p>
+        </w:tc>
+      </w:tr>
+      <w:tr>
+        <w:tc>
+          <w:tcPr>
+            <w:tcW w:type="dxa" w:w="4929"/>
+          </w:tcPr>
+          <w:p>
+            <w:pPr>
+              <w:spacing w:after="40" w:before="40"/>
+            </w:pPr>
+            <w:r>
+              <w:rPr>
+                <w:rFonts w:ascii="Consolas" w:hAnsi="Consolas"/>
+                <w:color w:val="3730A3"/>
+                <w:sz w:val="19"/>
+              </w:rPr>
+              <w:t>level_groups</w:t>
+            </w:r>
+          </w:p>
+        </w:tc>
+        <w:tc>
+          <w:tcPr>
+            <w:tcW w:type="dxa" w:w="4929"/>
+          </w:tcPr>
+          <w:p>
+            <w:pPr>
+              <w:spacing w:after="40" w:before="40"/>
+            </w:pPr>
+            <w:r>
+              <w:rPr>
+                <w:sz w:val="19"/>
+              </w:rPr>
+              <w:t>Kelompok varian (Level Pedas, Ukuran, …)</w:t>
+            </w:r>
+          </w:p>
+        </w:tc>
+      </w:tr>
+      <w:tr>
+        <w:tc>
+          <w:tcPr>
+            <w:tcW w:type="dxa" w:w="4929"/>
+            <w:shd w:val="clear" w:fill="F4F5FB"/>
+          </w:tcPr>
+          <w:p>
+            <w:pPr>
+              <w:spacing w:after="40" w:before="40"/>
+            </w:pPr>
+            <w:r>
+              <w:rPr>
+                <w:rFonts w:ascii="Consolas" w:hAnsi="Consolas"/>
+                <w:color w:val="3730A3"/>
+                <w:sz w:val="19"/>
+              </w:rPr>
+              <w:t>orders</w:t>
+            </w:r>
+          </w:p>
+        </w:tc>
+        <w:tc>
+          <w:tcPr>
+            <w:tcW w:type="dxa" w:w="4929"/>
+            <w:shd w:val="clear" w:fill="F4F5FB"/>
+          </w:tcPr>
+          <w:p>
+            <w:pPr>
+              <w:spacing w:after="40" w:before="40"/>
+            </w:pPr>
+            <w:r>
+              <w:rPr>
+                <w:sz w:val="19"/>
+              </w:rPr>
+              <w:t>Pesanan — pusat segalanya</w:t>
+            </w:r>
+          </w:p>
+        </w:tc>
+      </w:tr>
+      <w:tr>
+        <w:tc>
+          <w:tcPr>
+            <w:tcW w:type="dxa" w:w="4929"/>
+          </w:tcPr>
+          <w:p>
+            <w:pPr>
+              <w:spacing w:after="40" w:before="40"/>
+            </w:pPr>
+            <w:r>
+              <w:rPr>
+                <w:rFonts w:ascii="Consolas" w:hAnsi="Consolas"/>
+                <w:color w:val="3730A3"/>
+                <w:sz w:val="19"/>
+              </w:rPr>
+              <w:t>payment_charges</w:t>
+            </w:r>
+          </w:p>
+        </w:tc>
+        <w:tc>
+          <w:tcPr>
+            <w:tcW w:type="dxa" w:w="4929"/>
+          </w:tcPr>
+          <w:p>
+            <w:pPr>
+              <w:spacing w:after="40" w:before="40"/>
+            </w:pPr>
+            <w:r>
+              <w:rPr>
+                <w:sz w:val="19"/>
+              </w:rPr>
+              <w:t>Tagihan QRIS di sisi penyedia</w:t>
+            </w:r>
+          </w:p>
+        </w:tc>
+      </w:tr>
+      <w:tr>
+        <w:tc>
+          <w:tcPr>
+            <w:tcW w:type="dxa" w:w="4929"/>
+            <w:shd w:val="clear" w:fill="F4F5FB"/>
+          </w:tcPr>
+          <w:p>
+            <w:pPr>
+              <w:spacing w:after="40" w:before="40"/>
+            </w:pPr>
+            <w:r>
+              <w:rPr>
+                <w:rFonts w:ascii="Consolas" w:hAnsi="Consolas"/>
+                <w:color w:val="3730A3"/>
+                <w:sz w:val="19"/>
+              </w:rPr>
+              <w:t>discounts</w:t>
+            </w:r>
+          </w:p>
+        </w:tc>
+        <w:tc>
+          <w:tcPr>
+            <w:tcW w:type="dxa" w:w="4929"/>
+            <w:shd w:val="clear" w:fill="F4F5FB"/>
+          </w:tcPr>
+          <w:p>
+            <w:pPr>
+              <w:spacing w:after="40" w:before="40"/>
+            </w:pPr>
+            <w:r>
+              <w:rPr>
+                <w:sz w:val="19"/>
+              </w:rPr>
+              <w:t>Aturan promo</w:t>
+            </w:r>
+          </w:p>
+        </w:tc>
+      </w:tr>
+      <w:tr>
+        <w:tc>
+          <w:tcPr>
+            <w:tcW w:type="dxa" w:w="4929"/>
+          </w:tcPr>
+          <w:p>
+            <w:pPr>
+              <w:spacing w:after="40" w:before="40"/>
+            </w:pPr>
+            <w:r>
+              <w:rPr>
+                <w:rFonts w:ascii="Consolas" w:hAnsi="Consolas"/>
+                <w:color w:val="3730A3"/>
+                <w:sz w:val="19"/>
+              </w:rPr>
+              <w:t>promo_banners</w:t>
+            </w:r>
+          </w:p>
+        </w:tc>
+        <w:tc>
+          <w:tcPr>
+            <w:tcW w:type="dxa" w:w="4929"/>
+          </w:tcPr>
+          <w:p>
+            <w:pPr>
+              <w:spacing w:after="40" w:before="40"/>
+            </w:pPr>
+            <w:r>
+              <w:rPr>
+                <w:sz w:val="19"/>
+              </w:rPr>
+              <w:t>Banner di layar menu pelanggan</w:t>
+            </w:r>
+          </w:p>
+        </w:tc>
+      </w:tr>
+      <w:tr>
+        <w:tc>
+          <w:tcPr>
+            <w:tcW w:type="dxa" w:w="4929"/>
+            <w:shd w:val="clear" w:fill="F4F5FB"/>
+          </w:tcPr>
+          <w:p>
+            <w:pPr>
+              <w:spacing w:after="40" w:before="40"/>
+            </w:pPr>
+            <w:r>
+              <w:rPr>
+                <w:rFonts w:ascii="Consolas" w:hAnsi="Consolas"/>
+                <w:color w:val="3730A3"/>
+                <w:sz w:val="19"/>
+              </w:rPr>
+              <w:t>settings</w:t>
+            </w:r>
+          </w:p>
+        </w:tc>
+        <w:tc>
+          <w:tcPr>
+            <w:tcW w:type="dxa" w:w="4929"/>
+            <w:shd w:val="clear" w:fill="F4F5FB"/>
+          </w:tcPr>
+          <w:p>
+            <w:pPr>
+              <w:spacing w:after="40" w:before="40"/>
+            </w:pPr>
+            <w:r>
+              <w:rPr>
+                <w:sz w:val="19"/>
+              </w:rPr>
+              <w:t>Tarif pajak dan setelan resto</w:t>
+            </w:r>
+          </w:p>
+        </w:tc>
+      </w:tr>
+      <w:tr>
+        <w:tc>
+          <w:tcPr>
+            <w:tcW w:type="dxa" w:w="4929"/>
+          </w:tcPr>
+          <w:p>
+            <w:pPr>
+              <w:spacing w:after="40" w:before="40"/>
+            </w:pPr>
+            <w:r>
+              <w:rPr>
+                <w:rFonts w:ascii="Consolas" w:hAnsi="Consolas"/>
+                <w:color w:val="3730A3"/>
+                <w:sz w:val="19"/>
+              </w:rPr>
+              <w:t>resto_payment_accounts</w:t>
+            </w:r>
+          </w:p>
+        </w:tc>
+        <w:tc>
+          <w:tcPr>
+            <w:tcW w:type="dxa" w:w="4929"/>
+          </w:tcPr>
+          <w:p>
+            <w:pPr>
+              <w:spacing w:after="40" w:before="40"/>
+            </w:pPr>
+            <w:r>
+              <w:rPr>
+                <w:sz w:val="19"/>
+              </w:rPr>
+              <w:t>QRIS, rekening transfer, sub-akun gateway</w:t>
+            </w:r>
+          </w:p>
+        </w:tc>
+      </w:tr>
+      <w:tr>
+        <w:tc>
+          <w:tcPr>
+            <w:tcW w:type="dxa" w:w="4929"/>
+            <w:shd w:val="clear" w:fill="F4F5FB"/>
+          </w:tcPr>
+          <w:p>
+            <w:pPr>
+              <w:spacing w:after="40" w:before="40"/>
+            </w:pPr>
+            <w:r>
+              <w:rPr>
+                <w:rFonts w:ascii="Consolas" w:hAnsi="Consolas"/>
+                <w:color w:val="3730A3"/>
+                <w:sz w:val="19"/>
+              </w:rPr>
+              <w:t>gl_accounts</w:t>
+            </w:r>
+          </w:p>
+        </w:tc>
+        <w:tc>
+          <w:tcPr>
+            <w:tcW w:type="dxa" w:w="4929"/>
+            <w:shd w:val="clear" w:fill="F4F5FB"/>
+          </w:tcPr>
+          <w:p>
+            <w:pPr>
+              <w:spacing w:after="40" w:before="40"/>
+            </w:pPr>
+            <w:r>
+              <w:rPr>
+                <w:sz w:val="19"/>
+              </w:rPr>
+              <w:t>Nomor akun per resto per jenis</w:t>
+            </w:r>
+          </w:p>
+        </w:tc>
+      </w:tr>
+      <w:tr>
+        <w:tc>
+          <w:tcPr>
+            <w:tcW w:type="dxa" w:w="4929"/>
+          </w:tcPr>
+          <w:p>
+            <w:pPr>
+              <w:spacing w:after="40" w:before="40"/>
+            </w:pPr>
+            <w:r>
+              <w:rPr>
+                <w:rFonts w:ascii="Consolas" w:hAnsi="Consolas"/>
+                <w:color w:val="3730A3"/>
+                <w:sz w:val="19"/>
+              </w:rPr>
+              <w:t>gl_journal_entries</w:t>
+            </w:r>
+          </w:p>
+        </w:tc>
+        <w:tc>
+          <w:tcPr>
+            <w:tcW w:type="dxa" w:w="4929"/>
+          </w:tcPr>
+          <w:p>
+            <w:pPr>
+              <w:spacing w:after="40" w:before="40"/>
+            </w:pPr>
+            <w:r>
+              <w:rPr>
+                <w:sz w:val="19"/>
+              </w:rPr>
+              <w:t>Jurnal — satu baris satu pergerakan</w:t>
+            </w:r>
+          </w:p>
+        </w:tc>
+      </w:tr>
+      <w:tr>
+        <w:tc>
+          <w:tcPr>
+            <w:tcW w:type="dxa" w:w="4929"/>
+            <w:shd w:val="clear" w:fill="F4F5FB"/>
+          </w:tcPr>
+          <w:p>
+            <w:pPr>
+              <w:spacing w:after="40" w:before="40"/>
+            </w:pPr>
+            <w:r>
+              <w:rPr>
+                <w:rFonts w:ascii="Consolas" w:hAnsi="Consolas"/>
+                <w:color w:val="3730A3"/>
+                <w:sz w:val="19"/>
+              </w:rPr>
+              <w:t>expenses</w:t>
+            </w:r>
+          </w:p>
+        </w:tc>
+        <w:tc>
+          <w:tcPr>
+            <w:tcW w:type="dxa" w:w="4929"/>
+            <w:shd w:val="clear" w:fill="F4F5FB"/>
+          </w:tcPr>
+          <w:p>
+            <w:pPr>
+              <w:spacing w:after="40" w:before="40"/>
+            </w:pPr>
+            <w:r>
+              <w:rPr>
+                <w:sz w:val="19"/>
+              </w:rPr>
+              <w:t>Pengeluaran</w:t>
+            </w:r>
+          </w:p>
+        </w:tc>
+      </w:tr>
+      <w:tr>
+        <w:tc>
+          <w:tcPr>
+            <w:tcW w:type="dxa" w:w="4929"/>
+          </w:tcPr>
+          <w:p>
+            <w:pPr>
+              <w:spacing w:after="40" w:before="40"/>
+            </w:pPr>
+            <w:r>
+              <w:rPr>
+                <w:rFonts w:ascii="Consolas" w:hAnsi="Consolas"/>
+                <w:color w:val="3730A3"/>
+                <w:sz w:val="19"/>
+              </w:rPr>
+              <w:t>expense_gl_accounts</w:t>
+            </w:r>
+          </w:p>
+        </w:tc>
+        <w:tc>
+          <w:tcPr>
+            <w:tcW w:type="dxa" w:w="4929"/>
+          </w:tcPr>
+          <w:p>
+            <w:pPr>
+              <w:spacing w:after="40" w:before="40"/>
+            </w:pPr>
+            <w:r>
+              <w:rPr>
+                <w:sz w:val="19"/>
+              </w:rPr>
+              <w:t>Akun tujuan tiap jenis pengeluaran</w:t>
+            </w:r>
+          </w:p>
+        </w:tc>
+      </w:tr>
+      <w:tr>
+        <w:tc>
+          <w:tcPr>
+            <w:tcW w:type="dxa" w:w="4929"/>
+            <w:shd w:val="clear" w:fill="F4F5FB"/>
+          </w:tcPr>
+          <w:p>
+            <w:pPr>
+              <w:spacing w:after="40" w:before="40"/>
+            </w:pPr>
+            <w:r>
+              <w:rPr>
+                <w:rFonts w:ascii="Consolas" w:hAnsi="Consolas"/>
+                <w:color w:val="3730A3"/>
+                <w:sz w:val="19"/>
+              </w:rPr>
+              <w:t>petty_cash_entries</w:t>
+            </w:r>
+          </w:p>
+        </w:tc>
+        <w:tc>
+          <w:tcPr>
+            <w:tcW w:type="dxa" w:w="4929"/>
+            <w:shd w:val="clear" w:fill="F4F5FB"/>
+          </w:tcPr>
+          <w:p>
+            <w:pPr>
+              <w:spacing w:after="40" w:before="40"/>
+            </w:pPr>
+            <w:r>
+              <w:rPr>
+                <w:sz w:val="19"/>
+              </w:rPr>
+              <w:t>Kas kecil berikut alur persetujuannya</w:t>
+            </w:r>
+          </w:p>
+        </w:tc>
+      </w:tr>
+      <w:tr>
+        <w:tc>
+          <w:tcPr>
+            <w:tcW w:type="dxa" w:w="4929"/>
+          </w:tcPr>
+          <w:p>
+            <w:pPr>
+              <w:spacing w:after="40" w:before="40"/>
+            </w:pPr>
+            <w:r>
+              <w:rPr>
+                <w:rFonts w:ascii="Consolas" w:hAnsi="Consolas"/>
+                <w:color w:val="3730A3"/>
+                <w:sz w:val="19"/>
+              </w:rPr>
+              <w:t>cash_deposits</w:t>
+            </w:r>
+          </w:p>
+        </w:tc>
+        <w:tc>
+          <w:tcPr>
+            <w:tcW w:type="dxa" w:w="4929"/>
+          </w:tcPr>
+          <w:p>
+            <w:pPr>
+              <w:spacing w:after="40" w:before="40"/>
+            </w:pPr>
+            <w:r>
+              <w:rPr>
+                <w:sz w:val="19"/>
+              </w:rPr>
+              <w:t>Setoran tunai ke rekening</w:t>
+            </w:r>
+          </w:p>
+        </w:tc>
+      </w:tr>
+      <w:tr>
+        <w:tc>
+          <w:tcPr>
+            <w:tcW w:type="dxa" w:w="4929"/>
+            <w:shd w:val="clear" w:fill="F4F5FB"/>
+          </w:tcPr>
+          <w:p>
+            <w:pPr>
+              <w:spacing w:after="40" w:before="40"/>
+            </w:pPr>
+            <w:r>
+              <w:rPr>
+                <w:rFonts w:ascii="Consolas" w:hAnsi="Consolas"/>
+                <w:color w:val="3730A3"/>
+                <w:sz w:val="19"/>
+              </w:rPr>
+              <w:t>gateway_settlements</w:t>
+            </w:r>
+          </w:p>
+        </w:tc>
+        <w:tc>
+          <w:tcPr>
+            <w:tcW w:type="dxa" w:w="4929"/>
+            <w:shd w:val="clear" w:fill="F4F5FB"/>
+          </w:tcPr>
+          <w:p>
+            <w:pPr>
+              <w:spacing w:after="40" w:before="40"/>
+            </w:pPr>
+            <w:r>
+              <w:rPr>
+                <w:sz w:val="19"/>
+              </w:rPr>
+              <w:t>Pencairan penyedia berikut potongan MDR</w:t>
+            </w:r>
+          </w:p>
+        </w:tc>
+      </w:tr>
+      <w:tr>
+        <w:tc>
+          <w:tcPr>
+            <w:tcW w:type="dxa" w:w="4929"/>
+          </w:tcPr>
+          <w:p>
+            <w:pPr>
+              <w:spacing w:after="40" w:before="40"/>
+            </w:pPr>
+            <w:r>
+              <w:rPr>
+                <w:rFonts w:ascii="Consolas" w:hAnsi="Consolas"/>
+                <w:color w:val="3730A3"/>
+                <w:sz w:val="19"/>
+              </w:rPr>
+              <w:t>app_announcements</w:t>
+            </w:r>
+          </w:p>
+        </w:tc>
+        <w:tc>
+          <w:tcPr>
+            <w:tcW w:type="dxa" w:w="4929"/>
+          </w:tcPr>
+          <w:p>
+            <w:pPr>
+              <w:spacing w:after="40" w:before="40"/>
+            </w:pPr>
+            <w:r>
+              <w:rPr>
+                <w:sz w:val="19"/>
+              </w:rPr>
+              <w:t>Pengumuman — versi aplikasi maupun promo resto</w:t>
+            </w:r>
+          </w:p>
+        </w:tc>
+      </w:tr>
+      <w:tr>
+        <w:tc>
+          <w:tcPr>
+            <w:tcW w:type="dxa" w:w="4929"/>
+            <w:shd w:val="clear" w:fill="F4F5FB"/>
+          </w:tcPr>
+          <w:p>
+            <w:pPr>
+              <w:spacing w:after="40" w:before="40"/>
+            </w:pPr>
+            <w:r>
+              <w:rPr>
+                <w:rFonts w:ascii="Consolas" w:hAnsi="Consolas"/>
+                <w:color w:val="3730A3"/>
+                <w:sz w:val="19"/>
+              </w:rPr>
+              <w:t>inbox_states</w:t>
+            </w:r>
+          </w:p>
+        </w:tc>
+        <w:tc>
+          <w:tcPr>
+            <w:tcW w:type="dxa" w:w="4929"/>
+            <w:shd w:val="clear" w:fill="F4F5FB"/>
+          </w:tcPr>
+          <w:p>
+            <w:pPr>
+              <w:spacing w:after="40" w:before="40"/>
+            </w:pPr>
+            <w:r>
+              <w:rPr>
+                <w:sz w:val="19"/>
+              </w:rPr>
+              <w:t>Penanda sudah dibaca / terhapus, per orang</w:t>
+            </w:r>
+          </w:p>
+        </w:tc>
+      </w:tr>
+      <w:tr>
+        <w:tc>
+          <w:tcPr>
+            <w:tcW w:type="dxa" w:w="4929"/>
+          </w:tcPr>
+          <w:p>
+            <w:pPr>
+              <w:spacing w:after="40" w:before="40"/>
+            </w:pPr>
+            <w:r>
+              <w:rPr>
+                <w:rFonts w:ascii="Consolas" w:hAnsi="Consolas"/>
+                <w:color w:val="3730A3"/>
+                <w:sz w:val="19"/>
+              </w:rPr>
+              <w:t>device_tokens</w:t>
+            </w:r>
+          </w:p>
+        </w:tc>
+        <w:tc>
+          <w:tcPr>
+            <w:tcW w:type="dxa" w:w="4929"/>
+          </w:tcPr>
+          <w:p>
+            <w:pPr>
+              <w:spacing w:after="40" w:before="40"/>
+            </w:pPr>
+            <w:r>
+              <w:rPr>
+                <w:sz w:val="19"/>
+              </w:rPr>
+              <w:t>Token FCM tiap perangkat</w:t>
+            </w:r>
+          </w:p>
+        </w:tc>
+      </w:tr>
+      <w:tr>
+        <w:tc>
+          <w:tcPr>
+            <w:tcW w:type="dxa" w:w="4929"/>
+            <w:shd w:val="clear" w:fill="F4F5FB"/>
+          </w:tcPr>
+          <w:p>
+            <w:pPr>
+              <w:spacing w:after="40" w:before="40"/>
+            </w:pPr>
+            <w:r>
+              <w:rPr>
+                <w:rFonts w:ascii="Consolas" w:hAnsi="Consolas"/>
+                <w:color w:val="3730A3"/>
+                <w:sz w:val="19"/>
+              </w:rPr>
+              <w:t>push_config</w:t>
+            </w:r>
+          </w:p>
+        </w:tc>
+        <w:tc>
+          <w:tcPr>
+            <w:tcW w:type="dxa" w:w="4929"/>
+            <w:shd w:val="clear" w:fill="F4F5FB"/>
+          </w:tcPr>
+          <w:p>
+            <w:pPr>
+              <w:spacing w:after="40" w:before="40"/>
+            </w:pPr>
+            <w:r>
+              <w:rPr>
+                <w:sz w:val="19"/>
+              </w:rPr>
+              <w:t>Kunci dan setelan pengirim push</w:t>
+            </w:r>
+          </w:p>
+        </w:tc>
+      </w:tr>
+      <w:tr>
+        <w:tc>
+          <w:tcPr>
+            <w:tcW w:type="dxa" w:w="4929"/>
+          </w:tcPr>
+          <w:p>
+            <w:pPr>
+              <w:spacing w:after="40" w:before="40"/>
+            </w:pPr>
+            <w:r>
+              <w:rPr>
+                <w:rFonts w:ascii="Consolas" w:hAnsi="Consolas"/>
+                <w:color w:val="3730A3"/>
+                <w:sz w:val="19"/>
+              </w:rPr>
+              <w:t>push_outbox</w:t>
+            </w:r>
+          </w:p>
+        </w:tc>
+        <w:tc>
+          <w:tcPr>
+            <w:tcW w:type="dxa" w:w="4929"/>
+          </w:tcPr>
+          <w:p>
+            <w:pPr>
+              <w:spacing w:after="40" w:before="40"/>
+            </w:pPr>
+            <w:r>
+              <w:rPr>
+                <w:sz w:val="19"/>
+              </w:rPr>
+              <w:t>Antrean notifikasi yang menunggu dikirim</w:t>
+            </w:r>
+          </w:p>
+        </w:tc>
+      </w:tr>
+      <w:tr>
+        <w:tc>
+          <w:tcPr>
+            <w:tcW w:type="dxa" w:w="4929"/>
+            <w:shd w:val="clear" w:fill="F4F5FB"/>
+          </w:tcPr>
+          <w:p>
+            <w:pPr>
+              <w:spacing w:after="40" w:before="40"/>
+            </w:pPr>
+            <w:r>
+              <w:rPr>
+                <w:rFonts w:ascii="Consolas" w:hAnsi="Consolas"/>
+                <w:color w:val="3730A3"/>
+                <w:sz w:val="19"/>
+              </w:rPr>
+              <w:t>mail_requests</w:t>
+            </w:r>
+          </w:p>
+        </w:tc>
+        <w:tc>
+          <w:tcPr>
+            <w:tcW w:type="dxa" w:w="4929"/>
+            <w:shd w:val="clear" w:fill="F4F5FB"/>
+          </w:tcPr>
+          <w:p>
+            <w:pPr>
+              <w:spacing w:after="40" w:before="40"/>
+            </w:pPr>
+            <w:r>
+              <w:rPr>
+                <w:sz w:val="19"/>
+              </w:rPr>
+              <w:t>Permintaan kirim struk lewat email</w:t>
+            </w:r>
+          </w:p>
+        </w:tc>
+      </w:tr>
+      <w:tr>
+        <w:tc>
+          <w:tcPr>
+            <w:tcW w:type="dxa" w:w="4929"/>
+          </w:tcPr>
+          <w:p>
+            <w:pPr>
+              <w:spacing w:after="40" w:before="40"/>
+            </w:pPr>
+            <w:r>
+              <w:rPr>
+                <w:rFonts w:ascii="Consolas" w:hAnsi="Consolas"/>
+                <w:color w:val="3730A3"/>
+                <w:sz w:val="19"/>
+              </w:rPr>
+              <w:t>applied_migrations</w:t>
+            </w:r>
+          </w:p>
+        </w:tc>
+        <w:tc>
+          <w:tcPr>
+            <w:tcW w:type="dxa" w:w="4929"/>
+          </w:tcPr>
+          <w:p>
+            <w:pPr>
+              <w:spacing w:after="40" w:before="40"/>
+            </w:pPr>
+            <w:r>
+              <w:rPr>
+                <w:sz w:val="19"/>
+              </w:rPr>
+              <w:t>Penanda perbaikan data sekali-jalan — bukan catatan migrasi umum</w:t>
+            </w:r>
+          </w:p>
+        </w:tc>
+      </w:tr>
+    </w:tbl>
+    <w:p>
+      <w:r>
+        <w:rPr>
+          <w:sz w:val="21"/>
+        </w:rPr>
+        <w:t xml:space="preserve">Enam di antaranya tidak menyimpan data resto sama sekali — </w:t>
+      </w:r>
+      <w:r>
+        <w:rPr>
+          <w:rFonts w:ascii="Consolas" w:hAnsi="Consolas"/>
+          <w:color w:val="3730A3"/>
+          <w:sz w:val="21"/>
+        </w:rPr>
+        <w:t>device_tokens</w:t>
+      </w:r>
+      <w:r>
+        <w:rPr>
+          <w:sz w:val="21"/>
+        </w:rPr>
+        <w:t xml:space="preserve">, </w:t>
+      </w:r>
+      <w:r>
+        <w:rPr>
+          <w:rFonts w:ascii="Consolas" w:hAnsi="Consolas"/>
+          <w:color w:val="3730A3"/>
+          <w:sz w:val="21"/>
+        </w:rPr>
+        <w:t>push_config</w:t>
+      </w:r>
+      <w:r>
+        <w:rPr>
+          <w:sz w:val="21"/>
+        </w:rPr>
+        <w:t xml:space="preserve">, </w:t>
+      </w:r>
+      <w:r>
+        <w:rPr>
+          <w:rFonts w:ascii="Consolas" w:hAnsi="Consolas"/>
+          <w:color w:val="3730A3"/>
+          <w:sz w:val="21"/>
+        </w:rPr>
+        <w:t>push_outbox</w:t>
+      </w:r>
+      <w:r>
+        <w:rPr>
+          <w:sz w:val="21"/>
+        </w:rPr>
+        <w:t xml:space="preserve">, </w:t>
+      </w:r>
+      <w:r>
+        <w:rPr>
+          <w:rFonts w:ascii="Consolas" w:hAnsi="Consolas"/>
+          <w:color w:val="3730A3"/>
+          <w:sz w:val="21"/>
+        </w:rPr>
+        <w:t>mail_requests</w:t>
+      </w:r>
+      <w:r>
+        <w:rPr>
+          <w:sz w:val="21"/>
+        </w:rPr>
+        <w:t xml:space="preserve">, </w:t>
+      </w:r>
+      <w:r>
+        <w:rPr>
+          <w:rFonts w:ascii="Consolas" w:hAnsi="Consolas"/>
+          <w:color w:val="3730A3"/>
+          <w:sz w:val="21"/>
+        </w:rPr>
+        <w:t>inbox_states</w:t>
+      </w:r>
+      <w:r>
+        <w:rPr>
+          <w:sz w:val="21"/>
+        </w:rPr>
+        <w:t xml:space="preserve">, </w:t>
+      </w:r>
+      <w:r>
+        <w:rPr>
+          <w:rFonts w:ascii="Consolas" w:hAnsi="Consolas"/>
+          <w:color w:val="3730A3"/>
+          <w:sz w:val="21"/>
+        </w:rPr>
+        <w:t>applied_migrations</w:t>
+      </w:r>
+      <w:r>
+        <w:rPr>
+          <w:sz w:val="21"/>
+        </w:rPr>
+        <w:t xml:space="preserve"> adalah perkakas: antrean, token, dan penanda. Membedakannya sejak awal memudahkan saat memutuskan mana yang boleh dikosongkan tanpa kehilangan apa pun.</w:t>
+      </w:r>
+    </w:p>
+    <w:p>
+      <w:pPr>
+        <w:shd w:val="clear" w:fill="FFF7E6"/>
+        <w:pBdr>
+          <w:left w:val="single" w:sz="18" w:space="6" w:color="F59E0B"/>
+        </w:pBdr>
+        <w:spacing w:before="120"/>
+        <w:ind w:left="227"/>
+      </w:pPr>
+      <w:r>
+        <w:rPr>
+          <w:b/>
+          <w:sz w:val="20"/>
+        </w:rPr>
+        <w:t>`applied_migrations` mudah disalahpahami dari namanya.</w:t>
+      </w:r>
+      <w:r>
+        <w:rPr>
+          <w:sz w:val="20"/>
+        </w:rPr>
+        <w:t xml:space="preserve"> Ia tidak mencatat berkas SQL mana yang sudah dijalankan — lihat §11. Isinya sejauh ini satu baris, penanda bahwa satu perbaikan data sekali-jalan (</w:t>
+      </w:r>
+      <w:r>
+        <w:rPr>
+          <w:rFonts w:ascii="Consolas" w:hAnsi="Consolas"/>
+          <w:color w:val="3730A3"/>
+          <w:sz w:val="20"/>
+        </w:rPr>
+        <w:t>flip_transfer_journal_direction</w:t>
+      </w:r>
+      <w:r>
+        <w:rPr>
+          <w:sz w:val="20"/>
+        </w:rPr>
+        <w:t>) sudah dikerjakan dan tidak boleh dikerjakan lagi. Perbaikan yang membalik arah jurnal akan membalikkannya kembali kalau dijalankan dua kali, dan berkasnya memang dirancang untuk dijalankan berulang.</w:t>
       </w:r>
     </w:p>
     <w:p>
@@ -6788,6 +7992,70 @@
           <w:sz w:val="21"/>
         </w:rPr>
         <w:t xml:space="preserve"> (27 bagian) dengan urutan yang benar. Seluruhnya aman dijalankan berulang.</w:t>
+      </w:r>
+    </w:p>
+    <w:p>
+      <w:r>
+        <w:rPr>
+          <w:sz w:val="21"/>
+        </w:rPr>
+        <w:t xml:space="preserve">Aman-diulang itu ditanggung tiap berkasnya sendiri — </w:t>
+      </w:r>
+      <w:r>
+        <w:rPr>
+          <w:rFonts w:ascii="Consolas" w:hAnsi="Consolas"/>
+          <w:color w:val="3730A3"/>
+          <w:sz w:val="21"/>
+        </w:rPr>
+        <w:t>if not exists</w:t>
+      </w:r>
+      <w:r>
+        <w:rPr>
+          <w:sz w:val="21"/>
+        </w:rPr>
+        <w:t xml:space="preserve">, </w:t>
+      </w:r>
+      <w:r>
+        <w:rPr>
+          <w:rFonts w:ascii="Consolas" w:hAnsi="Consolas"/>
+          <w:color w:val="3730A3"/>
+          <w:sz w:val="21"/>
+        </w:rPr>
+        <w:t>or replace</w:t>
+      </w:r>
+      <w:r>
+        <w:rPr>
+          <w:sz w:val="21"/>
+        </w:rPr>
+        <w:t xml:space="preserve">, </w:t>
+      </w:r>
+      <w:r>
+        <w:rPr>
+          <w:rFonts w:ascii="Consolas" w:hAnsi="Consolas"/>
+          <w:color w:val="3730A3"/>
+          <w:sz w:val="21"/>
+        </w:rPr>
+        <w:t>on conflict do nothing</w:t>
+      </w:r>
+      <w:r>
+        <w:rPr>
+          <w:sz w:val="21"/>
+        </w:rPr>
+        <w:t xml:space="preserve"> — bukan oleh catatan pusat yang melacak apa yang sudah jalan. Tidak ada catatan semacam itu. Satu-satunya pengecualian adalah perbaikan yang tidak bisa dibuat idempoten dengan cara itu, dan hanya perbaikan seperti itulah yang memakai penanda di </w:t>
+      </w:r>
+      <w:r>
+        <w:rPr>
+          <w:rFonts w:ascii="Consolas" w:hAnsi="Consolas"/>
+          <w:color w:val="3730A3"/>
+          <w:sz w:val="21"/>
+        </w:rPr>
+        <w:t>applied_migrations</w:t>
+      </w:r>
+      <w:r>
+        <w:rPr>
+          <w:sz w:val="21"/>
+        </w:rPr>
+        <w:t>.</w:t>
       </w:r>
     </w:p>
     <w:p>

</xml_diff>

<commit_message>
TSD: enam diagram relasi tabel
Digambar langsung jadi PNG — Word tidak merender mermaid, dan tangkapan
layar diagram dari browser buram saat dicetak.

Dipecah per wilayah, bukan satu ERD berisi 27 tabel: pada lebar kertas,
satu gambar besar jadi terlalu kecil untuk dibaca.

Garis penuh untuk kunci asing sungguhan, garis putus untuk yang cuma
kesepakatan. Bedanya tidak terlihat saat membaca kode — order.resto_id
dan order.session_id sama-sama kolom berisi id — tapi yang putus adalah
tempat data yatim bisa muncul.

Co-Authored-By: Claude Opus 5 <noreply@anthropic.com>
</commit_message>
<xml_diff>
--- a/docs/TSD-KAATAGO.docx
+++ b/docs/TSD-KAATAGO.docx
@@ -2247,7 +2247,782 @@
         <w:pStyle w:val="Heading2"/>
       </w:pPr>
       <w:r>
-        <w:t>4.0 Daftar lengkap</w:t>
+        <w:t>4.0 Peta relasi</w:t>
+      </w:r>
+    </w:p>
+    <w:p>
+      <w:r>
+        <w:rPr>
+          <w:sz w:val="21"/>
+        </w:rPr>
+        <w:t>Dipecah per wilayah, bukan satu diagram berisi 27 tabel sekaligus. Satu gambar besar memang memuat semuanya, tapi pada lebar kertas tulisannya jadi terlalu kecil untuk dibaca — dan diagram yang tidak terbaca sama saja dengan tidak ada.</w:t>
+      </w:r>
+    </w:p>
+    <w:p>
+      <w:r>
+        <w:rPr>
+          <w:sz w:val="21"/>
+        </w:rPr>
+        <w:t>Dua jenis garis, dan bedanya bukan hiasan:</w:t>
+      </w:r>
+    </w:p>
+    <w:tbl>
+      <w:tblPr>
+        <w:tblStyle w:val="TableGrid"/>
+        <w:tblW w:type="auto" w:w="0"/>
+        <w:tblLayout w:type="autofit"/>
+        <w:tblLook w:firstColumn="1" w:firstRow="1" w:lastColumn="0" w:lastRow="0" w:noHBand="0" w:noVBand="1" w:val="04A0"/>
+      </w:tblPr>
+      <w:tblGrid>
+        <w:gridCol w:w="4929"/>
+        <w:gridCol w:w="4929"/>
+      </w:tblGrid>
+      <w:tr>
+        <w:trPr>
+          <w:tblHeader w:val="true"/>
+        </w:trPr>
+        <w:tc>
+          <w:tcPr>
+            <w:tcW w:type="dxa" w:w="4929"/>
+            <w:shd w:val="clear" w:fill="4F46E5"/>
+          </w:tcPr>
+          <w:p>
+            <w:pPr>
+              <w:spacing w:after="40" w:before="40"/>
+            </w:pPr>
+            <w:r>
+              <w:rPr>
+                <w:b/>
+                <w:color w:val="FFFFFF"/>
+                <w:sz w:val="19"/>
+              </w:rPr>
+              <w:t>Garis</w:t>
+            </w:r>
+          </w:p>
+        </w:tc>
+        <w:tc>
+          <w:tcPr>
+            <w:tcW w:type="dxa" w:w="4929"/>
+            <w:shd w:val="clear" w:fill="4F46E5"/>
+          </w:tcPr>
+          <w:p>
+            <w:pPr>
+              <w:spacing w:after="40" w:before="40"/>
+            </w:pPr>
+            <w:r>
+              <w:rPr>
+                <w:b/>
+                <w:color w:val="FFFFFF"/>
+                <w:sz w:val="19"/>
+              </w:rPr>
+              <w:t>Artinya</w:t>
+            </w:r>
+          </w:p>
+        </w:tc>
+      </w:tr>
+      <w:tr>
+        <w:tc>
+          <w:tcPr>
+            <w:tcW w:type="dxa" w:w="4929"/>
+          </w:tcPr>
+          <w:p>
+            <w:pPr>
+              <w:spacing w:after="40" w:before="40"/>
+            </w:pPr>
+            <w:r>
+              <w:rPr>
+                <w:b/>
+                <w:sz w:val="19"/>
+              </w:rPr>
+              <w:t>Penuh</w:t>
+            </w:r>
+          </w:p>
+        </w:tc>
+        <w:tc>
+          <w:tcPr>
+            <w:tcW w:type="dxa" w:w="4929"/>
+          </w:tcPr>
+          <w:p>
+            <w:pPr>
+              <w:spacing w:after="40" w:before="40"/>
+            </w:pPr>
+            <w:r>
+              <w:rPr>
+                <w:sz w:val="19"/>
+              </w:rPr>
+              <w:t>Kunci asing sungguhan — database yang menegakkannya</w:t>
+            </w:r>
+          </w:p>
+        </w:tc>
+      </w:tr>
+      <w:tr>
+        <w:tc>
+          <w:tcPr>
+            <w:tcW w:type="dxa" w:w="4929"/>
+            <w:shd w:val="clear" w:fill="F4F5FB"/>
+          </w:tcPr>
+          <w:p>
+            <w:pPr>
+              <w:spacing w:after="40" w:before="40"/>
+            </w:pPr>
+            <w:r>
+              <w:rPr>
+                <w:b/>
+                <w:sz w:val="19"/>
+              </w:rPr>
+              <w:t>Putus</w:t>
+            </w:r>
+          </w:p>
+        </w:tc>
+        <w:tc>
+          <w:tcPr>
+            <w:tcW w:type="dxa" w:w="4929"/>
+            <w:shd w:val="clear" w:fill="F4F5FB"/>
+          </w:tcPr>
+          <w:p>
+            <w:pPr>
+              <w:spacing w:after="40" w:before="40"/>
+            </w:pPr>
+            <w:r>
+              <w:rPr>
+                <w:sz w:val="19"/>
+              </w:rPr>
+              <w:t>Cuma kesepakatan — tidak ada yang mencegahnya dilanggar</w:t>
+            </w:r>
+          </w:p>
+        </w:tc>
+      </w:tr>
+    </w:tbl>
+    <w:p>
+      <w:pPr>
+        <w:shd w:val="clear" w:fill="FFF7E6"/>
+        <w:pBdr>
+          <w:left w:val="single" w:sz="18" w:space="6" w:color="F59E0B"/>
+        </w:pBdr>
+        <w:spacing w:before="120"/>
+        <w:ind w:left="227"/>
+      </w:pPr>
+      <w:r>
+        <w:rPr>
+          <w:b/>
+          <w:sz w:val="20"/>
+        </w:rPr>
+        <w:t>Yang putus adalah tempat data yatim bisa muncul.</w:t>
+      </w:r>
+      <w:r>
+        <w:rPr>
+          <w:sz w:val="20"/>
+        </w:rPr>
+        <w:t xml:space="preserve"> Saat membaca kode, </w:t>
+      </w:r>
+      <w:r>
+        <w:rPr>
+          <w:rFonts w:ascii="Consolas" w:hAnsi="Consolas"/>
+          <w:color w:val="3730A3"/>
+          <w:sz w:val="20"/>
+        </w:rPr>
+        <w:t>order.session_id</w:t>
+      </w:r>
+      <w:r>
+        <w:rPr>
+          <w:sz w:val="20"/>
+        </w:rPr>
+        <w:t xml:space="preserve"> dan </w:t>
+      </w:r>
+      <w:r>
+        <w:rPr>
+          <w:rFonts w:ascii="Consolas" w:hAnsi="Consolas"/>
+          <w:color w:val="3730A3"/>
+          <w:sz w:val="20"/>
+        </w:rPr>
+        <w:t>order.resto_id</w:t>
+      </w:r>
+      <w:r>
+        <w:rPr>
+          <w:sz w:val="20"/>
+        </w:rPr>
+        <w:t xml:space="preserve"> terlihat sama persis — keduanya kolom berisi id. Bedanya baru terasa saat sesinya terhapus: </w:t>
+      </w:r>
+      <w:r>
+        <w:rPr>
+          <w:rFonts w:ascii="Consolas" w:hAnsi="Consolas"/>
+          <w:color w:val="3730A3"/>
+          <w:sz w:val="20"/>
+        </w:rPr>
+        <w:t>resto_id</w:t>
+      </w:r>
+      <w:r>
+        <w:rPr>
+          <w:sz w:val="20"/>
+        </w:rPr>
+        <w:t xml:space="preserve"> ditolak database, </w:t>
+      </w:r>
+      <w:r>
+        <w:rPr>
+          <w:rFonts w:ascii="Consolas" w:hAnsi="Consolas"/>
+          <w:color w:val="3730A3"/>
+          <w:sz w:val="20"/>
+        </w:rPr>
+        <w:t>session_id</w:t>
+      </w:r>
+      <w:r>
+        <w:rPr>
+          <w:sz w:val="20"/>
+        </w:rPr>
+        <w:t xml:space="preserve"> dibiarkan menunjuk ke sesuatu yang sudah tidak ada.</w:t>
+      </w:r>
+    </w:p>
+    <w:p>
+      <w:pPr>
+        <w:spacing w:before="160"/>
+        <w:jc w:val="center"/>
+      </w:pPr>
+      <w:r>
+        <w:drawing>
+          <wp:inline xmlns:a="http://schemas.openxmlformats.org/drawingml/2006/main" xmlns:pic="http://schemas.openxmlformats.org/drawingml/2006/picture">
+            <wp:extent cx="5580000" cy="3472816"/>
+            <wp:docPr id="2" name="Picture 2"/>
+            <wp:cNvGraphicFramePr>
+              <a:graphicFrameLocks noChangeAspect="1"/>
+            </wp:cNvGraphicFramePr>
+            <a:graphic>
+              <a:graphicData uri="http://schemas.openxmlformats.org/drawingml/2006/picture">
+                <pic:pic>
+                  <pic:nvPicPr>
+                    <pic:cNvPr id="0" name="erd-00-peta.png"/>
+                    <pic:cNvPicPr/>
+                  </pic:nvPicPr>
+                  <pic:blipFill>
+                    <a:blip r:embed="rId12"/>
+                    <a:stretch>
+                      <a:fillRect/>
+                    </a:stretch>
+                  </pic:blipFill>
+                  <pic:spPr>
+                    <a:xfrm>
+                      <a:off x="0" y="0"/>
+                      <a:ext cx="5580000" cy="3472816"/>
+                    </a:xfrm>
+                    <a:prstGeom prst="rect"/>
+                  </pic:spPr>
+                </pic:pic>
+              </a:graphicData>
+            </a:graphic>
+          </wp:inline>
+        </w:drawing>
+      </w:r>
+    </w:p>
+    <w:p>
+      <w:pPr>
+        <w:jc w:val="center"/>
+      </w:pPr>
+      <w:r>
+        <w:rPr>
+          <w:i/>
+          <w:color w:val="6E728C"/>
+          <w:sz w:val="18"/>
+        </w:rPr>
+        <w:t>Peta seluruh tabel — hampir semuanya menggantung pada restaurants</w:t>
+      </w:r>
+    </w:p>
+    <w:p>
+      <w:r>
+        <w:rPr>
+          <w:sz w:val="21"/>
+        </w:rPr>
+        <w:t>Menghapus sebuah resto menghapus seluruh isinya, dan itu memang yang diinginkan. Yang perlu diingat: tidak ada satu pun tabel keuangan yang kebal dari itu. Jurnal GL sebuah resto ikut hilang bersama restonya.</w:t>
+      </w:r>
+    </w:p>
+    <w:p>
+      <w:pPr>
+        <w:spacing w:before="160"/>
+        <w:jc w:val="center"/>
+      </w:pPr>
+      <w:r>
+        <w:drawing>
+          <wp:inline xmlns:a="http://schemas.openxmlformats.org/drawingml/2006/main" xmlns:pic="http://schemas.openxmlformats.org/drawingml/2006/picture">
+            <wp:extent cx="5580000" cy="3098368"/>
+            <wp:docPr id="3" name="Picture 3"/>
+            <wp:cNvGraphicFramePr>
+              <a:graphicFrameLocks noChangeAspect="1"/>
+            </wp:cNvGraphicFramePr>
+            <a:graphic>
+              <a:graphicData uri="http://schemas.openxmlformats.org/drawingml/2006/picture">
+                <pic:pic>
+                  <pic:nvPicPr>
+                    <pic:cNvPr id="0" name="erd-01-katalog.png"/>
+                    <pic:cNvPicPr/>
+                  </pic:nvPicPr>
+                  <pic:blipFill>
+                    <a:blip r:embed="rId13"/>
+                    <a:stretch>
+                      <a:fillRect/>
+                    </a:stretch>
+                  </pic:blipFill>
+                  <pic:spPr>
+                    <a:xfrm>
+                      <a:off x="0" y="0"/>
+                      <a:ext cx="5580000" cy="3098368"/>
+                    </a:xfrm>
+                    <a:prstGeom prst="rect"/>
+                  </pic:spPr>
+                </pic:pic>
+              </a:graphicData>
+            </a:graphic>
+          </wp:inline>
+        </w:drawing>
+      </w:r>
+    </w:p>
+    <w:p>
+      <w:pPr>
+        <w:jc w:val="center"/>
+      </w:pPr>
+      <w:r>
+        <w:rPr>
+          <w:i/>
+          <w:color w:val="6E728C"/>
+          <w:sz w:val="18"/>
+        </w:rPr>
+        <w:t>Katalog &amp; pengaturan resto</w:t>
+      </w:r>
+    </w:p>
+    <w:p>
+      <w:r>
+        <w:rPr>
+          <w:rFonts w:ascii="Consolas" w:hAnsi="Consolas"/>
+          <w:color w:val="3730A3"/>
+          <w:sz w:val="21"/>
+        </w:rPr>
+        <w:t>products.category</w:t>
+      </w:r>
+      <w:r>
+        <w:rPr>
+          <w:sz w:val="21"/>
+        </w:rPr>
+        <w:t xml:space="preserve"> menyimpan </w:t>
+      </w:r>
+      <w:r>
+        <w:rPr>
+          <w:b/>
+          <w:sz w:val="21"/>
+        </w:rPr>
+        <w:t>nama</w:t>
+      </w:r>
+      <w:r>
+        <w:rPr>
+          <w:sz w:val="21"/>
+        </w:rPr>
+        <w:t xml:space="preserve"> kategorinya, bukan id-nya. Itu warisan dari sebelum tabel </w:t>
+      </w:r>
+      <w:r>
+        <w:rPr>
+          <w:rFonts w:ascii="Consolas" w:hAnsi="Consolas"/>
+          <w:color w:val="3730A3"/>
+          <w:sz w:val="21"/>
+        </w:rPr>
+        <w:t>categories</w:t>
+      </w:r>
+      <w:r>
+        <w:rPr>
+          <w:sz w:val="21"/>
+        </w:rPr>
+        <w:t xml:space="preserve"> ada, dan akibatnya masih terasa: mengganti nama kategori tidak ikut mengganti nama di produknya.</w:t>
+      </w:r>
+    </w:p>
+    <w:p>
+      <w:pPr>
+        <w:spacing w:before="160"/>
+        <w:jc w:val="center"/>
+      </w:pPr>
+      <w:r>
+        <w:drawing>
+          <wp:inline xmlns:a="http://schemas.openxmlformats.org/drawingml/2006/main" xmlns:pic="http://schemas.openxmlformats.org/drawingml/2006/picture">
+            <wp:extent cx="5580000" cy="3098368"/>
+            <wp:docPr id="4" name="Picture 4"/>
+            <wp:cNvGraphicFramePr>
+              <a:graphicFrameLocks noChangeAspect="1"/>
+            </wp:cNvGraphicFramePr>
+            <a:graphic>
+              <a:graphicData uri="http://schemas.openxmlformats.org/drawingml/2006/picture">
+                <pic:pic>
+                  <pic:nvPicPr>
+                    <pic:cNvPr id="0" name="erd-02-pesanan.png"/>
+                    <pic:cNvPicPr/>
+                  </pic:nvPicPr>
+                  <pic:blipFill>
+                    <a:blip r:embed="rId14"/>
+                    <a:stretch>
+                      <a:fillRect/>
+                    </a:stretch>
+                  </pic:blipFill>
+                  <pic:spPr>
+                    <a:xfrm>
+                      <a:off x="0" y="0"/>
+                      <a:ext cx="5580000" cy="3098368"/>
+                    </a:xfrm>
+                    <a:prstGeom prst="rect"/>
+                  </pic:spPr>
+                </pic:pic>
+              </a:graphicData>
+            </a:graphic>
+          </wp:inline>
+        </w:drawing>
+      </w:r>
+    </w:p>
+    <w:p>
+      <w:pPr>
+        <w:jc w:val="center"/>
+      </w:pPr>
+      <w:r>
+        <w:rPr>
+          <w:i/>
+          <w:color w:val="6E728C"/>
+          <w:sz w:val="18"/>
+        </w:rPr>
+        <w:t>Pesanan, sesi meja, dan pembayaran</w:t>
+      </w:r>
+    </w:p>
+    <w:p>
+      <w:r>
+        <w:rPr>
+          <w:b/>
+          <w:sz w:val="21"/>
+        </w:rPr>
+        <w:t>Tidak ada tabel baris pesanan.</w:t>
+      </w:r>
+      <w:r>
+        <w:rPr>
+          <w:sz w:val="21"/>
+        </w:rPr>
+        <w:t xml:space="preserve"> Isi pesanan disimpan sebagai jsonb di </w:t>
+      </w:r>
+      <w:r>
+        <w:rPr>
+          <w:rFonts w:ascii="Consolas" w:hAnsi="Consolas"/>
+          <w:color w:val="3730A3"/>
+          <w:sz w:val="21"/>
+        </w:rPr>
+        <w:t>orders.items</w:t>
+      </w:r>
+      <w:r>
+        <w:rPr>
+          <w:sz w:val="21"/>
+        </w:rPr>
+        <w:t xml:space="preserve">. Itu keputusan yang disengaja: struk harus menyebut menu persis seperti saat dipesan — nama, harga, dan level yang dipilih — sementara menu di katalog boleh berubah besok. Baris pesanan yang merujuk </w:t>
+      </w:r>
+      <w:r>
+        <w:rPr>
+          <w:rFonts w:ascii="Consolas" w:hAnsi="Consolas"/>
+          <w:color w:val="3730A3"/>
+          <w:sz w:val="21"/>
+        </w:rPr>
+        <w:t>products.id</w:t>
+      </w:r>
+      <w:r>
+        <w:rPr>
+          <w:sz w:val="21"/>
+        </w:rPr>
+        <w:t xml:space="preserve"> akan ikut berubah bersama produknya, dan struk lama jadi berbohong.</w:t>
+      </w:r>
+    </w:p>
+    <w:p>
+      <w:r>
+        <w:rPr>
+          <w:sz w:val="21"/>
+        </w:rPr>
+        <w:t>Harganya juga: yang tersimpan adalah harga saat itu, bukan rujukan ke harga sekarang.</w:t>
+      </w:r>
+    </w:p>
+    <w:p>
+      <w:pPr>
+        <w:spacing w:before="160"/>
+        <w:jc w:val="center"/>
+      </w:pPr>
+      <w:r>
+        <w:drawing>
+          <wp:inline xmlns:a="http://schemas.openxmlformats.org/drawingml/2006/main" xmlns:pic="http://schemas.openxmlformats.org/drawingml/2006/picture">
+            <wp:extent cx="5580000" cy="2716579"/>
+            <wp:docPr id="5" name="Picture 5"/>
+            <wp:cNvGraphicFramePr>
+              <a:graphicFrameLocks noChangeAspect="1"/>
+            </wp:cNvGraphicFramePr>
+            <a:graphic>
+              <a:graphicData uri="http://schemas.openxmlformats.org/drawingml/2006/picture">
+                <pic:pic>
+                  <pic:nvPicPr>
+                    <pic:cNvPr id="0" name="erd-03-keuangan.png"/>
+                    <pic:cNvPicPr/>
+                  </pic:nvPicPr>
+                  <pic:blipFill>
+                    <a:blip r:embed="rId15"/>
+                    <a:stretch>
+                      <a:fillRect/>
+                    </a:stretch>
+                  </pic:blipFill>
+                  <pic:spPr>
+                    <a:xfrm>
+                      <a:off x="0" y="0"/>
+                      <a:ext cx="5580000" cy="2716579"/>
+                    </a:xfrm>
+                    <a:prstGeom prst="rect"/>
+                  </pic:spPr>
+                </pic:pic>
+              </a:graphicData>
+            </a:graphic>
+          </wp:inline>
+        </w:drawing>
+      </w:r>
+    </w:p>
+    <w:p>
+      <w:pPr>
+        <w:jc w:val="center"/>
+      </w:pPr>
+      <w:r>
+        <w:rPr>
+          <w:i/>
+          <w:color w:val="6E728C"/>
+          <w:sz w:val="18"/>
+        </w:rPr>
+        <w:t>Buku besar — seluruhnya diisi pemicu, tidak ada kunci asing ke jurnal</w:t>
+      </w:r>
+    </w:p>
+    <w:p>
+      <w:r>
+        <w:rPr>
+          <w:sz w:val="21"/>
+        </w:rPr>
+        <w:t xml:space="preserve">Seluruh panah ke </w:t>
+      </w:r>
+      <w:r>
+        <w:rPr>
+          <w:rFonts w:ascii="Consolas" w:hAnsi="Consolas"/>
+          <w:color w:val="3730A3"/>
+          <w:sz w:val="21"/>
+        </w:rPr>
+        <w:t>gl_journal_entries</w:t>
+      </w:r>
+      <w:r>
+        <w:rPr>
+          <w:sz w:val="21"/>
+        </w:rPr>
+        <w:t xml:space="preserve"> putus, dan itu bukan kelalaian. </w:t>
+      </w:r>
+      <w:r>
+        <w:rPr>
+          <w:rFonts w:ascii="Consolas" w:hAnsi="Consolas"/>
+          <w:color w:val="3730A3"/>
+          <w:sz w:val="21"/>
+        </w:rPr>
+        <w:t>reference_id</w:t>
+      </w:r>
+      <w:r>
+        <w:rPr>
+          <w:sz w:val="21"/>
+        </w:rPr>
+        <w:t xml:space="preserve"> bisa menunjuk pesanan, pengeluaran, kas kecil, setoran, atau pencairan — lima tabel berbeda, dibedakan </w:t>
+      </w:r>
+      <w:r>
+        <w:rPr>
+          <w:rFonts w:ascii="Consolas" w:hAnsi="Consolas"/>
+          <w:color w:val="3730A3"/>
+          <w:sz w:val="21"/>
+        </w:rPr>
+        <w:t>reference_type</w:t>
+      </w:r>
+      <w:r>
+        <w:rPr>
+          <w:sz w:val="21"/>
+        </w:rPr>
+        <w:t>. Satu kolom tidak bisa berkunci asing ke lima tabel sekaligus.</w:t>
+      </w:r>
+    </w:p>
+    <w:p>
+      <w:r>
+        <w:rPr>
+          <w:sz w:val="21"/>
+        </w:rPr>
+        <w:t>Harganya adalah jurnal yang bisa menunjuk baris yang sudah terhapus. Yang menutupi itu adalah fungsi pembalik: menghapus pengeluaran menuliskan jurnal balikannya, bukan menghapus jurnal aslinya. Jurnal tidak pernah dihapus — hanya ditambah.</w:t>
+      </w:r>
+    </w:p>
+    <w:p>
+      <w:pPr>
+        <w:spacing w:before="160"/>
+        <w:jc w:val="center"/>
+      </w:pPr>
+      <w:r>
+        <w:drawing>
+          <wp:inline xmlns:a="http://schemas.openxmlformats.org/drawingml/2006/main" xmlns:pic="http://schemas.openxmlformats.org/drawingml/2006/picture">
+            <wp:extent cx="5580000" cy="2621132"/>
+            <wp:docPr id="6" name="Picture 6"/>
+            <wp:cNvGraphicFramePr>
+              <a:graphicFrameLocks noChangeAspect="1"/>
+            </wp:cNvGraphicFramePr>
+            <a:graphic>
+              <a:graphicData uri="http://schemas.openxmlformats.org/drawingml/2006/picture">
+                <pic:pic>
+                  <pic:nvPicPr>
+                    <pic:cNvPr id="0" name="erd-04-promo.png"/>
+                    <pic:cNvPicPr/>
+                  </pic:nvPicPr>
+                  <pic:blipFill>
+                    <a:blip r:embed="rId16"/>
+                    <a:stretch>
+                      <a:fillRect/>
+                    </a:stretch>
+                  </pic:blipFill>
+                  <pic:spPr>
+                    <a:xfrm>
+                      <a:off x="0" y="0"/>
+                      <a:ext cx="5580000" cy="2621132"/>
+                    </a:xfrm>
+                    <a:prstGeom prst="rect"/>
+                  </pic:spPr>
+                </pic:pic>
+              </a:graphicData>
+            </a:graphic>
+          </wp:inline>
+        </w:drawing>
+      </w:r>
+    </w:p>
+    <w:p>
+      <w:pPr>
+        <w:jc w:val="center"/>
+      </w:pPr>
+      <w:r>
+        <w:rPr>
+          <w:i/>
+          <w:color w:val="6E728C"/>
+          <w:sz w:val="18"/>
+        </w:rPr>
+        <w:t>Diskon &amp; banner promo</w:t>
+      </w:r>
+    </w:p>
+    <w:p>
+      <w:r>
+        <w:rPr>
+          <w:rFonts w:ascii="Consolas" w:hAnsi="Consolas"/>
+          <w:color w:val="3730A3"/>
+          <w:sz w:val="21"/>
+        </w:rPr>
+        <w:t>discounts</w:t>
+      </w:r>
+      <w:r>
+        <w:rPr>
+          <w:sz w:val="21"/>
+        </w:rPr>
+        <w:t xml:space="preserve"> menunjuk produk lewat id </w:t>
+      </w:r>
+      <w:r>
+        <w:rPr>
+          <w:b/>
+          <w:sz w:val="21"/>
+        </w:rPr>
+        <w:t>di dalam jsonb</w:t>
+      </w:r>
+      <w:r>
+        <w:rPr>
+          <w:sz w:val="21"/>
+        </w:rPr>
+        <w:t>, jadi tidak ada yang mencegah promo menunjuk menu yang sudah dihapus. Promo semacam itu tidak pernah mengenai apa pun dan tidak menimbulkan galat — ia hanya diam.</w:t>
+      </w:r>
+    </w:p>
+    <w:p>
+      <w:r>
+        <w:rPr>
+          <w:sz w:val="21"/>
+        </w:rPr>
+        <w:t xml:space="preserve">Ke arah pesanan, hubungannya sengaja diputus: </w:t>
+      </w:r>
+      <w:r>
+        <w:rPr>
+          <w:rFonts w:ascii="Consolas" w:hAnsi="Consolas"/>
+          <w:color w:val="3730A3"/>
+          <w:sz w:val="21"/>
+        </w:rPr>
+        <w:t>orders.discount_amount</w:t>
+      </w:r>
+      <w:r>
+        <w:rPr>
+          <w:sz w:val="21"/>
+        </w:rPr>
+        <w:t xml:space="preserve"> adalah salinan, bukan rujukan. Aturan promonya boleh disunting atau dihapus besok tanpa mengubah struk hari ini.</w:t>
+      </w:r>
+    </w:p>
+    <w:p>
+      <w:pPr>
+        <w:spacing w:before="160"/>
+        <w:jc w:val="center"/>
+      </w:pPr>
+      <w:r>
+        <w:drawing>
+          <wp:inline xmlns:a="http://schemas.openxmlformats.org/drawingml/2006/main" xmlns:pic="http://schemas.openxmlformats.org/drawingml/2006/picture">
+            <wp:extent cx="5580000" cy="2812026"/>
+            <wp:docPr id="7" name="Picture 7"/>
+            <wp:cNvGraphicFramePr>
+              <a:graphicFrameLocks noChangeAspect="1"/>
+            </wp:cNvGraphicFramePr>
+            <a:graphic>
+              <a:graphicData uri="http://schemas.openxmlformats.org/drawingml/2006/picture">
+                <pic:pic>
+                  <pic:nvPicPr>
+                    <pic:cNvPr id="0" name="erd-05-kabar.png"/>
+                    <pic:cNvPicPr/>
+                  </pic:nvPicPr>
+                  <pic:blipFill>
+                    <a:blip r:embed="rId17"/>
+                    <a:stretch>
+                      <a:fillRect/>
+                    </a:stretch>
+                  </pic:blipFill>
+                  <pic:spPr>
+                    <a:xfrm>
+                      <a:off x="0" y="0"/>
+                      <a:ext cx="5580000" cy="2812026"/>
+                    </a:xfrm>
+                    <a:prstGeom prst="rect"/>
+                  </pic:spPr>
+                </pic:pic>
+              </a:graphicData>
+            </a:graphic>
+          </wp:inline>
+        </w:drawing>
+      </w:r>
+    </w:p>
+    <w:p>
+      <w:pPr>
+        <w:jc w:val="center"/>
+      </w:pPr>
+      <w:r>
+        <w:rPr>
+          <w:i/>
+          <w:color w:val="6E728C"/>
+          <w:sz w:val="18"/>
+        </w:rPr>
+        <w:t>Pengumuman &amp; notifikasi</w:t>
+      </w:r>
+    </w:p>
+    <w:p>
+      <w:r>
+        <w:rPr>
+          <w:rFonts w:ascii="Consolas" w:hAnsi="Consolas"/>
+          <w:color w:val="3730A3"/>
+          <w:sz w:val="21"/>
+        </w:rPr>
+        <w:t>inbox_states</w:t>
+      </w:r>
+      <w:r>
+        <w:rPr>
+          <w:sz w:val="21"/>
+        </w:rPr>
+        <w:t xml:space="preserve"> memisahkan penanda "sudah dibaca" dari pengumumannya. Satu pengumuman dibaca banyak orang pada waktu berbeda — menaruh penandanya di barisnya sendiri berarti pengumuman itu hanya bisa "sudah dibaca" oleh satu orang.</w:t>
+      </w:r>
+    </w:p>
+    <w:p>
+      <w:pPr>
+        <w:pStyle w:val="Heading2"/>
+      </w:pPr>
+      <w:r>
+        <w:t>4.1 Daftar lengkap</w:t>
       </w:r>
     </w:p>
     <w:tbl>
@@ -3437,7 +4212,7 @@
         <w:pStyle w:val="Heading2"/>
       </w:pPr>
       <w:r>
-        <w:t>4.1 Inti</w:t>
+        <w:t>4.2 Inti</w:t>
       </w:r>
     </w:p>
     <w:tbl>
@@ -3933,7 +4708,7 @@
         <w:pStyle w:val="Heading2"/>
       </w:pPr>
       <w:r>
-        <w:t>4.2 Kolom orders yang menentukan perilaku</w:t>
+        <w:t>4.3 Kolom orders yang menentukan perilaku</w:t>
       </w:r>
     </w:p>
     <w:tbl>
@@ -4759,7 +5534,7 @@
         <w:pStyle w:val="Heading2"/>
       </w:pPr>
       <w:r>
-        <w:t>4.3 Keuangan</w:t>
+        <w:t>4.4 Keuangan</w:t>
       </w:r>
     </w:p>
     <w:tbl>
@@ -5058,7 +5833,7 @@
         <w:pStyle w:val="Heading2"/>
       </w:pPr>
       <w:r>
-        <w:t>4.4 Diskon</w:t>
+        <w:t>4.5 Diskon</w:t>
       </w:r>
     </w:p>
     <w:p>

</xml_diff>

<commit_message>
TSD: dua diagram arsitektur — sisi pengguna dan sisi teknis
Dipisah karena pembacanya berbeda. Orang resto tidak menemukan dirinya
di diagram berisi "pg_net" dan "RLS"; pengembang tidak menemukan tempat
menambal kode di diagram berisi "Kasir menerima uang". Satu gambar yang
memuat keduanya gagal untuk dua-duanya.

Jalur push diperiksa ulang sebelum digambar: pg_net memanggil send-push,
dan send-push yang berbicara ke FCM — bukan pg_net langsung. Aplikasi
sendiri tetap berhubungan dengan FCM untuk mendaftarkan tokennya; yang
tidak pernah dipegangnya adalah wewenang mengirim.

Co-Authored-By: Claude Opus 5 <noreply@anthropic.com>
</commit_message>
<xml_diff>
--- a/docs/TSD-KAATAGO.docx
+++ b/docs/TSD-KAATAGO.docx
@@ -380,87 +380,194 @@
         <w:rPr>
           <w:sz w:val="21"/>
         </w:rPr>
-        <w:t>KaataGo adalah aplikasi Flutter tunggal yang berbicara langsung ke Supabase. Tidak ada server aplikasi milik sendiri di tengahnya.</w:t>
+        <w:t>Dua gambar untuk satu sistem yang sama, dari dua tempat berdiri yang berbeda. Dipisah karena pembacanya berbeda: orang resto yang membaca diagram berisi "pg_net" dan "RLS" tidak menemukan dirinya di sana, dan pengembang yang membaca diagram berisi "Kasir menerima uang" tidak menemukan tempat menambal kodenya. Satu gambar yang memuat keduanya gagal untuk dua-duanya sekaligus.</w:t>
       </w:r>
     </w:p>
     <w:p>
       <w:pPr>
-        <w:shd w:val="clear" w:fill="F2F3F8"/>
-        <w:spacing w:before="80"/>
-        <w:ind w:left="283"/>
+        <w:pStyle w:val="Heading2"/>
       </w:pPr>
       <w:r>
-        <w:rPr>
-          <w:rFonts w:ascii="Consolas" w:hAnsi="Consolas"/>
-          <w:color w:val="3730A3"/>
-          <w:sz w:val="19"/>
-        </w:rPr>
-        <w:t>┌──────────────────────────────────────────┐</w:t>
-        <w:br/>
-        <w:t>│  Aplikasi Flutter (Android)              │</w:t>
-        <w:br/>
-        <w:t>│  ┌────────────┐  ┌──────────┐            │</w:t>
-        <w:br/>
-        <w:t>│  │  Layar     │→ │ Provider │            │</w:t>
-        <w:br/>
-        <w:t>│  └────────────┘  └────┬─────┘            │</w:t>
-        <w:br/>
-        <w:t>│                       ↓                  │</w:t>
-        <w:br/>
-        <w:t>│              ┌────────────────┐          │</w:t>
-        <w:br/>
-        <w:t>│              │  Repository    │          │</w:t>
-        <w:br/>
-        <w:t>│              └───┬────────┬───┘          │</w:t>
-        <w:br/>
-        <w:t>│                  ↓        ↓              │</w:t>
-        <w:br/>
-        <w:t>│          ┌───────────┐ ┌────────┐        │</w:t>
-        <w:br/>
-        <w:t>│          │  sqflite  │ │Supabase│        │</w:t>
-        <w:br/>
-        <w:t>│          │  (lokal)  │ │ client │        │</w:t>
-        <w:br/>
-        <w:t>│          └───────────┘ └───┬────┘        │</w:t>
-        <w:br/>
-        <w:t>└────────────────────────────┼─────────────┘</w:t>
-        <w:br/>
-        <w:t xml:space="preserve">                             ↓</w:t>
-        <w:br/>
-        <w:t xml:space="preserve">        ┌────────────────────────────────────┐</w:t>
-        <w:br/>
-        <w:t xml:space="preserve">        │  Supabase                          │</w:t>
-        <w:br/>
-        <w:t xml:space="preserve">        │  Postgres + RLS                    │</w:t>
-        <w:br/>
-        <w:t xml:space="preserve">        │  Edge Functions (Deno)             │</w:t>
-        <w:br/>
-        <w:t xml:space="preserve">        │  pg_cron · pg_net                  │</w:t>
-        <w:br/>
-        <w:t xml:space="preserve">        └───┬──────────────┬─────────────┬───┘</w:t>
-        <w:br/>
-        <w:t xml:space="preserve">            ↓              ↓             ↓</w:t>
-        <w:br/>
-        <w:t xml:space="preserve">        ┌───────┐    ┌──────────┐   ┌────────┐</w:t>
-        <w:br/>
-        <w:t xml:space="preserve">        │Xendit │    │ FCM v1   │   │ Resend │</w:t>
-        <w:br/>
-        <w:t xml:space="preserve">        └───────┘    └──────────┘   └────────┘</w:t>
+        <w:t>1.1 Dari sisi pengguna</w:t>
       </w:r>
     </w:p>
     <w:p>
+      <w:pPr>
+        <w:spacing w:before="160"/>
+        <w:jc w:val="center"/>
+      </w:pPr>
+      <w:r>
+        <w:drawing>
+          <wp:inline xmlns:a="http://schemas.openxmlformats.org/drawingml/2006/main" xmlns:pic="http://schemas.openxmlformats.org/drawingml/2006/picture">
+            <wp:extent cx="5580000" cy="2568231"/>
+            <wp:docPr id="2" name="Picture 2"/>
+            <wp:cNvGraphicFramePr>
+              <a:graphicFrameLocks noChangeAspect="1"/>
+            </wp:cNvGraphicFramePr>
+            <a:graphic>
+              <a:graphicData uri="http://schemas.openxmlformats.org/drawingml/2006/picture">
+                <pic:pic>
+                  <pic:nvPicPr>
+                    <pic:cNvPr id="0" name="arsitektur-01-pengguna.png"/>
+                    <pic:cNvPicPr/>
+                  </pic:nvPicPr>
+                  <pic:blipFill>
+                    <a:blip r:embed="rId12"/>
+                    <a:stretch>
+                      <a:fillRect/>
+                    </a:stretch>
+                  </pic:blipFill>
+                  <pic:spPr>
+                    <a:xfrm>
+                      <a:off x="0" y="0"/>
+                      <a:ext cx="5580000" cy="2568231"/>
+                    </a:xfrm>
+                    <a:prstGeom prst="rect"/>
+                  </pic:spPr>
+                </pic:pic>
+              </a:graphicData>
+            </a:graphic>
+          </wp:inline>
+        </w:drawing>
+      </w:r>
+    </w:p>
+    <w:p>
+      <w:pPr>
+        <w:jc w:val="center"/>
+      </w:pPr>
+      <w:r>
+        <w:rPr>
+          <w:i/>
+          <w:color w:val="6E728C"/>
+          <w:sz w:val="18"/>
+        </w:rPr>
+        <w:t>Arsitektur dari sisi pengguna</w:t>
+      </w:r>
+    </w:p>
+    <w:p>
+      <w:r>
+        <w:rPr>
+          <w:sz w:val="21"/>
+        </w:rPr>
+        <w:t>Tidak ada satu pun nama teknologi di gambar ini. Yang digambarkan adalah apa yang berpindah tangan: pesanan, uang, dan catatannya.</w:t>
+      </w:r>
+    </w:p>
+    <w:p>
+      <w:r>
+        <w:rPr>
+          <w:sz w:val="21"/>
+        </w:rPr>
+        <w:t xml:space="preserve">Dua hal yang paling sering ditanyakan terjawab di sini. </w:t>
+      </w:r>
       <w:r>
         <w:rPr>
           <w:b/>
           <w:sz w:val="21"/>
         </w:rPr>
-        <w:t>Keputusan yang menentukan bentuk seluruhnya:</w:t>
+        <w:t>Pesanan dari HP pelanggan yang memilih bayar tunai tidak langsung ke dapur</w:t>
       </w:r>
       <w:r>
         <w:rPr>
           <w:sz w:val="21"/>
         </w:rPr>
-        <w:t xml:space="preserve"> tidak ada lapisan server di antara aplikasi dan basis data. Yang menggantikannya adalah RLS — aturan keamanan yang hidup di Postgres, bukan di kode aplikasi. Konsekuensinya harus diterima sepenuhnya: </w:t>
+        <w:t xml:space="preserve"> — ia mampir di Pending Payment sampai kasir menerima uangnya, karena bahan yang sudah terpakai adalah kerugian nyata dan yang menanggungnya bukan pihak yang menekan tombolnya. Dan </w:t>
+      </w:r>
+      <w:r>
+        <w:rPr>
+          <w:b/>
+          <w:sz w:val="21"/>
+        </w:rPr>
+        <w:t>Owner tidak punya layar khusus miliknya sendiri</w:t>
+      </w:r>
+      <w:r>
+        <w:rPr>
+          <w:sz w:val="21"/>
+        </w:rPr>
+        <w:t>; yang dia punya adalah seluruh layar di atasnya.</w:t>
+      </w:r>
+    </w:p>
+    <w:p>
+      <w:pPr>
+        <w:pStyle w:val="Heading2"/>
+      </w:pPr>
+      <w:r>
+        <w:t>1.2 Dari sisi teknis</w:t>
+      </w:r>
+    </w:p>
+    <w:p>
+      <w:pPr>
+        <w:spacing w:before="160"/>
+        <w:jc w:val="center"/>
+      </w:pPr>
+      <w:r>
+        <w:drawing>
+          <wp:inline xmlns:a="http://schemas.openxmlformats.org/drawingml/2006/main" xmlns:pic="http://schemas.openxmlformats.org/drawingml/2006/picture">
+            <wp:extent cx="5580000" cy="2725615"/>
+            <wp:docPr id="3" name="Picture 3"/>
+            <wp:cNvGraphicFramePr>
+              <a:graphicFrameLocks noChangeAspect="1"/>
+            </wp:cNvGraphicFramePr>
+            <a:graphic>
+              <a:graphicData uri="http://schemas.openxmlformats.org/drawingml/2006/picture">
+                <pic:pic>
+                  <pic:nvPicPr>
+                    <pic:cNvPr id="0" name="arsitektur-02-teknikal.png"/>
+                    <pic:cNvPicPr/>
+                  </pic:nvPicPr>
+                  <pic:blipFill>
+                    <a:blip r:embed="rId13"/>
+                    <a:stretch>
+                      <a:fillRect/>
+                    </a:stretch>
+                  </pic:blipFill>
+                  <pic:spPr>
+                    <a:xfrm>
+                      <a:off x="0" y="0"/>
+                      <a:ext cx="5580000" cy="2725615"/>
+                    </a:xfrm>
+                    <a:prstGeom prst="rect"/>
+                  </pic:spPr>
+                </pic:pic>
+              </a:graphicData>
+            </a:graphic>
+          </wp:inline>
+        </w:drawing>
+      </w:r>
+    </w:p>
+    <w:p>
+      <w:pPr>
+        <w:jc w:val="center"/>
+      </w:pPr>
+      <w:r>
+        <w:rPr>
+          <w:i/>
+          <w:color w:val="6E728C"/>
+          <w:sz w:val="18"/>
+        </w:rPr>
+        <w:t>Arsitektur teknis</w:t>
+      </w:r>
+    </w:p>
+    <w:p>
+      <w:r>
+        <w:rPr>
+          <w:sz w:val="21"/>
+        </w:rPr>
+        <w:t xml:space="preserve">KaataGo adalah aplikasi Flutter tunggal yang berbicara langsung ke Supabase. </w:t>
+      </w:r>
+      <w:r>
+        <w:rPr>
+          <w:b/>
+          <w:sz w:val="21"/>
+        </w:rPr>
+        <w:t>Tidak ada server aplikasi milik sendiri di tengahnya.</w:t>
+      </w:r>
+    </w:p>
+    <w:p>
+      <w:r>
+        <w:rPr>
+          <w:sz w:val="21"/>
+        </w:rPr>
+        <w:t xml:space="preserve">Yang menggantikannya adalah RLS — aturan keamanan yang hidup di Postgres, bukan di kode aplikasi. Konsekuensinya harus diterima sepenuhnya: </w:t>
       </w:r>
       <w:r>
         <w:rPr>
@@ -473,7 +580,36 @@
         <w:rPr>
           <w:sz w:val="21"/>
         </w:rPr>
-        <w:t xml:space="preserve"> Siapa pun yang memegang kunci publik proyek bisa memanggil API-nya langsung. Karena itu tiap aturan penting ditulis dua kali — di formulir supaya orangnya tahu, dan di basis data supaya benar.</w:t>
+        <w:t xml:space="preserve"> Siapa pun yang memegang kunci publik proyek bisa memanggil API-nya langsung, tanpa lewat layar mana pun. Karena itu tiap aturan penting ditulis dua kali — di formulir supaya orangnya tahu, dan di basis data supaya benar.</w:t>
+      </w:r>
+    </w:p>
+    <w:p>
+      <w:r>
+        <w:rPr>
+          <w:sz w:val="21"/>
+        </w:rPr>
+        <w:t xml:space="preserve">Perhatikan arah panah ke pihak ketiga. Yang </w:t>
+      </w:r>
+      <w:r>
+        <w:rPr>
+          <w:b/>
+          <w:sz w:val="21"/>
+        </w:rPr>
+        <w:t>mengirim</w:t>
+      </w:r>
+      <w:r>
+        <w:rPr>
+          <w:sz w:val="21"/>
+        </w:rPr>
+        <w:t xml:space="preserve"> ke Xendit, FCM, dan Resend selalu fungsi edge, tidak pernah aplikasinya. Itu bukan kerapian arsitektur melainkan syarat: kunci penyedia pembayaran yang ditaruh di dalam APK sama saja dengan diumumkan, karena APK bisa dibongkar siapa saja yang mengunduhnya.</w:t>
+      </w:r>
+    </w:p>
+    <w:p>
+      <w:r>
+        <w:rPr>
+          <w:sz w:val="21"/>
+        </w:rPr>
+        <w:t>Aplikasi tetap berhubungan dengan FCM untuk hal yang tidak butuh kunci rahasia — mendaftarkan token perangkatnya sendiri dan menerima pesan yang masuk. Yang tidak pernah dipegangnya adalah wewenang mengirim.</w:t>
       </w:r>
     </w:p>
     <w:p>
@@ -2481,7 +2617,7 @@
         <w:drawing>
           <wp:inline xmlns:a="http://schemas.openxmlformats.org/drawingml/2006/main" xmlns:pic="http://schemas.openxmlformats.org/drawingml/2006/picture">
             <wp:extent cx="5580000" cy="3472816"/>
-            <wp:docPr id="2" name="Picture 2"/>
+            <wp:docPr id="4" name="Picture 4"/>
             <wp:cNvGraphicFramePr>
               <a:graphicFrameLocks noChangeAspect="1"/>
             </wp:cNvGraphicFramePr>
@@ -2493,7 +2629,7 @@
                     <pic:cNvPicPr/>
                   </pic:nvPicPr>
                   <pic:blipFill>
-                    <a:blip r:embed="rId12"/>
+                    <a:blip r:embed="rId14"/>
                     <a:stretch>
                       <a:fillRect/>
                     </a:stretch>
@@ -2542,7 +2678,7 @@
         <w:drawing>
           <wp:inline xmlns:a="http://schemas.openxmlformats.org/drawingml/2006/main" xmlns:pic="http://schemas.openxmlformats.org/drawingml/2006/picture">
             <wp:extent cx="5580000" cy="3098368"/>
-            <wp:docPr id="3" name="Picture 3"/>
+            <wp:docPr id="5" name="Picture 5"/>
             <wp:cNvGraphicFramePr>
               <a:graphicFrameLocks noChangeAspect="1"/>
             </wp:cNvGraphicFramePr>
@@ -2554,7 +2690,7 @@
                     <pic:cNvPicPr/>
                   </pic:nvPicPr>
                   <pic:blipFill>
-                    <a:blip r:embed="rId13"/>
+                    <a:blip r:embed="rId15"/>
                     <a:stretch>
                       <a:fillRect/>
                     </a:stretch>
@@ -2638,7 +2774,7 @@
         <w:drawing>
           <wp:inline xmlns:a="http://schemas.openxmlformats.org/drawingml/2006/main" xmlns:pic="http://schemas.openxmlformats.org/drawingml/2006/picture">
             <wp:extent cx="5580000" cy="3098368"/>
-            <wp:docPr id="4" name="Picture 4"/>
+            <wp:docPr id="6" name="Picture 6"/>
             <wp:cNvGraphicFramePr>
               <a:graphicFrameLocks noChangeAspect="1"/>
             </wp:cNvGraphicFramePr>
@@ -2650,7 +2786,7 @@
                     <pic:cNvPicPr/>
                   </pic:nvPicPr>
                   <pic:blipFill>
-                    <a:blip r:embed="rId14"/>
+                    <a:blip r:embed="rId16"/>
                     <a:stretch>
                       <a:fillRect/>
                     </a:stretch>
@@ -2742,7 +2878,7 @@
         <w:drawing>
           <wp:inline xmlns:a="http://schemas.openxmlformats.org/drawingml/2006/main" xmlns:pic="http://schemas.openxmlformats.org/drawingml/2006/picture">
             <wp:extent cx="5580000" cy="2716579"/>
-            <wp:docPr id="5" name="Picture 5"/>
+            <wp:docPr id="7" name="Picture 7"/>
             <wp:cNvGraphicFramePr>
               <a:graphicFrameLocks noChangeAspect="1"/>
             </wp:cNvGraphicFramePr>
@@ -2754,7 +2890,7 @@
                     <pic:cNvPicPr/>
                   </pic:nvPicPr>
                   <pic:blipFill>
-                    <a:blip r:embed="rId15"/>
+                    <a:blip r:embed="rId17"/>
                     <a:stretch>
                       <a:fillRect/>
                     </a:stretch>
@@ -2853,7 +2989,7 @@
         <w:drawing>
           <wp:inline xmlns:a="http://schemas.openxmlformats.org/drawingml/2006/main" xmlns:pic="http://schemas.openxmlformats.org/drawingml/2006/picture">
             <wp:extent cx="5580000" cy="2621132"/>
-            <wp:docPr id="6" name="Picture 6"/>
+            <wp:docPr id="8" name="Picture 8"/>
             <wp:cNvGraphicFramePr>
               <a:graphicFrameLocks noChangeAspect="1"/>
             </wp:cNvGraphicFramePr>
@@ -2865,7 +3001,7 @@
                     <pic:cNvPicPr/>
                   </pic:nvPicPr>
                   <pic:blipFill>
-                    <a:blip r:embed="rId16"/>
+                    <a:blip r:embed="rId18"/>
                     <a:stretch>
                       <a:fillRect/>
                     </a:stretch>
@@ -2957,7 +3093,7 @@
         <w:drawing>
           <wp:inline xmlns:a="http://schemas.openxmlformats.org/drawingml/2006/main" xmlns:pic="http://schemas.openxmlformats.org/drawingml/2006/picture">
             <wp:extent cx="5580000" cy="2812026"/>
-            <wp:docPr id="7" name="Picture 7"/>
+            <wp:docPr id="9" name="Picture 9"/>
             <wp:cNvGraphicFramePr>
               <a:graphicFrameLocks noChangeAspect="1"/>
             </wp:cNvGraphicFramePr>
@@ -2969,7 +3105,7 @@
                     <pic:cNvPicPr/>
                   </pic:nvPicPr>
                   <pic:blipFill>
-                    <a:blip r:embed="rId17"/>
+                    <a:blip r:embed="rId19"/>
                     <a:stretch>
                       <a:fillRect/>
                     </a:stretch>

</xml_diff>

<commit_message>
Arsitektur pengguna: alur tunai lewat Kasir, bukan melompatinya
Gambar sebelumnya menarik panah dari Pending Payment langsung ke dapur.
Itu melompati titik tempat uangnya benar-benar berpindah tangan — dan
dari titik itulah pesanan lanjut ke dapur, jurnal GL tercatat, dan uang
tunai masuk ke laci yang nanti disetorkan.

Co-Authored-By: Claude Opus 5 <noreply@anthropic.com>
</commit_message>
<xml_diff>
--- a/docs/TSD-KAATAGO.docx
+++ b/docs/TSD-KAATAGO.docx
@@ -399,7 +399,7 @@
       <w:r>
         <w:drawing>
           <wp:inline xmlns:a="http://schemas.openxmlformats.org/drawingml/2006/main" xmlns:pic="http://schemas.openxmlformats.org/drawingml/2006/picture">
-            <wp:extent cx="5580000" cy="2568231"/>
+            <wp:extent cx="5580000" cy="2646923"/>
             <wp:docPr id="2" name="Picture 2"/>
             <wp:cNvGraphicFramePr>
               <a:graphicFrameLocks noChangeAspect="1"/>
@@ -420,7 +420,7 @@
                   <pic:spPr>
                     <a:xfrm>
                       <a:off x="0" y="0"/>
-                      <a:ext cx="5580000" cy="2568231"/>
+                      <a:ext cx="5580000" cy="2646923"/>
                     </a:xfrm>
                     <a:prstGeom prst="rect"/>
                   </pic:spPr>
@@ -457,20 +457,53 @@
         <w:rPr>
           <w:sz w:val="21"/>
         </w:rPr>
-        <w:t xml:space="preserve">Dua hal yang paling sering ditanyakan terjawab di sini. </w:t>
-      </w:r>
+        <w:t>Perhatikan dua jalur yang berbeda sesudah pelanggan memilih cara bayar.</w:t>
+      </w:r>
+    </w:p>
+    <w:p>
       <w:r>
         <w:rPr>
           <w:b/>
           <w:sz w:val="21"/>
         </w:rPr>
-        <w:t>Pesanan dari HP pelanggan yang memilih bayar tunai tidak langsung ke dapur</w:t>
+        <w:t>QRIS lunas seketika</w:t>
       </w:r>
       <w:r>
         <w:rPr>
           <w:sz w:val="21"/>
         </w:rPr>
-        <w:t xml:space="preserve"> — ia mampir di Pending Payment sampai kasir menerima uangnya, karena bahan yang sudah terpakai adalah kerugian nyata dan yang menanggungnya bukan pihak yang menekan tombolnya. Dan </w:t>
+        <w:t>, jadi pesanannya langsung masuk antrean dapur.</w:t>
+      </w:r>
+    </w:p>
+    <w:p>
+      <w:r>
+        <w:rPr>
+          <w:b/>
+          <w:sz w:val="21"/>
+        </w:rPr>
+        <w:t>Tunai tidak.</w:t>
+      </w:r>
+      <w:r>
+        <w:rPr>
+          <w:sz w:val="21"/>
+        </w:rPr>
+        <w:t xml:space="preserve"> Ia mampir di Pending Payment, dan baru bergerak setelah melewati Kasir — karena di situlah uangnya benar-benar berpindah tangan. Kasir adalah titik yang tidak boleh dilompati: dari sanalah pesanannya lanjut ke dapur, jurnal GL-nya tercatat, dan uang tunainya masuk ke laci yang nanti disetorkan.</w:t>
+      </w:r>
+    </w:p>
+    <w:p>
+      <w:r>
+        <w:rPr>
+          <w:sz w:val="21"/>
+        </w:rPr>
+        <w:t>Bahan yang sudah terpakai adalah kerugian nyata, dan yang menanggungnya bukan pihak yang menekan tombolnya di HP.</w:t>
+      </w:r>
+    </w:p>
+    <w:p>
+      <w:r>
+        <w:rPr>
+          <w:sz w:val="21"/>
+        </w:rPr>
+        <w:t xml:space="preserve">Satu hal lagi yang sering ditanyakan: </w:t>
       </w:r>
       <w:r>
         <w:rPr>

</xml_diff>

<commit_message>
Billing langganan resto: harga & tanggal per resto, kunci saat menunggak
Harga dan tanggal jatuh tempo diatur Super Admin per resto. H-3 muncul
pita pengingat; lewat tenggang dan belum dibayar, restonya terkunci.

Penguncian dipasang sebagai kebijakan RLS restrictive, bukan hanya di
layar. Aplikasi ini bicara langsung ke Postgres tanpa server perantara
— layar yang terkunci hanyalah layar, dan siapa pun yang memegang kunci
publik proyek bisa memanggil API-nya langsung.

Tiga hal sengaja tidak dikunci: membaca tagihan, mengunggah bukti, dan
keluar akun. Mengunci jalan keluarnya sendiri akan meninggalkan resto
yang sudah membayar tanpa cara memberi tahu siapa pun.

Bukti yang sudah diunggah menahan penguncian selama diperiksa. Transfer
antarbank yang dikirim Jumat sore baru terlihat Senin, dan menghentikan
penjualan sehari penuh karena keterlambatan yang bukan salahnya adalah
kesalahan yang paling mahal di seluruh fitur ini.

Co-Authored-By: Claude Opus 5 <noreply@anthropic.com>
</commit_message>
<xml_diff>
--- a/docs/TSD-KAATAGO.docx
+++ b/docs/TSD-KAATAGO.docx
@@ -2394,7 +2394,7 @@
         <w:rPr>
           <w:sz w:val="21"/>
         </w:rPr>
-        <w:t xml:space="preserve">27 tabel, seluruhnya di skema </w:t>
+        <w:t xml:space="preserve">29 tabel, seluruhnya di skema </w:t>
       </w:r>
       <w:r>
         <w:rPr>
@@ -4225,6 +4225,80 @@
                 <w:color w:val="3730A3"/>
                 <w:sz w:val="19"/>
               </w:rPr>
+              <w:t>resto_billing</w:t>
+            </w:r>
+          </w:p>
+        </w:tc>
+        <w:tc>
+          <w:tcPr>
+            <w:tcW w:type="dxa" w:w="4929"/>
+          </w:tcPr>
+          <w:p>
+            <w:pPr>
+              <w:spacing w:after="40" w:before="40"/>
+            </w:pPr>
+            <w:r>
+              <w:rPr>
+                <w:sz w:val="19"/>
+              </w:rPr>
+              <w:t>Harga &amp; tanggal langganan tiap resto</w:t>
+            </w:r>
+          </w:p>
+        </w:tc>
+      </w:tr>
+      <w:tr>
+        <w:tc>
+          <w:tcPr>
+            <w:tcW w:type="dxa" w:w="4929"/>
+            <w:shd w:val="clear" w:fill="F4F5FB"/>
+          </w:tcPr>
+          <w:p>
+            <w:pPr>
+              <w:spacing w:after="40" w:before="40"/>
+            </w:pPr>
+            <w:r>
+              <w:rPr>
+                <w:rFonts w:ascii="Consolas" w:hAnsi="Consolas"/>
+                <w:color w:val="3730A3"/>
+                <w:sz w:val="19"/>
+              </w:rPr>
+              <w:t>billing_invoices</w:t>
+            </w:r>
+          </w:p>
+        </w:tc>
+        <w:tc>
+          <w:tcPr>
+            <w:tcW w:type="dxa" w:w="4929"/>
+            <w:shd w:val="clear" w:fill="F4F5FB"/>
+          </w:tcPr>
+          <w:p>
+            <w:pPr>
+              <w:spacing w:after="40" w:before="40"/>
+            </w:pPr>
+            <w:r>
+              <w:rPr>
+                <w:sz w:val="19"/>
+              </w:rPr>
+              <w:t>Tagihan bulanan berikut bukti bayarnya</w:t>
+            </w:r>
+          </w:p>
+        </w:tc>
+      </w:tr>
+      <w:tr>
+        <w:tc>
+          <w:tcPr>
+            <w:tcW w:type="dxa" w:w="4929"/>
+          </w:tcPr>
+          <w:p>
+            <w:pPr>
+              <w:spacing w:after="40" w:before="40"/>
+            </w:pPr>
+            <w:r>
+              <w:rPr>
+                <w:rFonts w:ascii="Consolas" w:hAnsi="Consolas"/>
+                <w:color w:val="3730A3"/>
+                <w:sz w:val="19"/>
+              </w:rPr>
               <w:t>applied_migrations</w:t>
             </w:r>
           </w:p>
@@ -8211,6 +8285,478 @@
           <w:sz w:val="21"/>
         </w:rPr>
         <w:t>. Keduanya harus diubah bersamaan.</w:t>
+      </w:r>
+    </w:p>
+    <w:p>
+      <w:pPr>
+        <w:pStyle w:val="Heading1"/>
+      </w:pPr>
+      <w:r>
+        <w:t>7.3 Langganan resto</w:t>
+      </w:r>
+    </w:p>
+    <w:p>
+      <w:r>
+        <w:rPr>
+          <w:sz w:val="21"/>
+        </w:rPr>
+        <w:t>Satu-satunya aliran uang yang arahnya keluar dari resto menuju KaataGo. Dipisah sepenuhnya dari buku besar resto — jurnal GL mencatat uang yang masuk ke restonya, dan menyeret tagihan langganan ke sana akan membuat biaya kami muncul sebagai pengeluaran resto di laporan yang dibaca Finance mereka.</w:t>
+      </w:r>
+    </w:p>
+    <w:p>
+      <w:pPr>
+        <w:pStyle w:val="Heading2"/>
+      </w:pPr>
+      <w:r>
+        <w:t>Penguncian ditegakkan di RLS, bukan di layar</w:t>
+      </w:r>
+    </w:p>
+    <w:p>
+      <w:r>
+        <w:rPr>
+          <w:sz w:val="21"/>
+        </w:rPr>
+        <w:t>Layar yang terkunci hanyalah layar. Aplikasi ini berbicara langsung ke Postgres tanpa server perantara, jadi siapa pun yang memegang kunci publik proyek bisa memanggil API-nya langsung dan tetap membuat pesanan.</w:t>
+      </w:r>
+    </w:p>
+    <w:p>
+      <w:r>
+        <w:rPr>
+          <w:sz w:val="21"/>
+        </w:rPr>
+        <w:t xml:space="preserve">Karena itu penguncian dipasang sebagai kebijakan </w:t>
+      </w:r>
+      <w:r>
+        <w:rPr>
+          <w:b/>
+          <w:sz w:val="21"/>
+        </w:rPr>
+        <w:t>RESTRICTIVE</w:t>
+      </w:r>
+      <w:r>
+        <w:rPr>
+          <w:sz w:val="21"/>
+        </w:rPr>
+        <w:t>:</w:t>
+      </w:r>
+    </w:p>
+    <w:p>
+      <w:pPr>
+        <w:shd w:val="clear" w:fill="F2F3F8"/>
+        <w:spacing w:before="80"/>
+        <w:ind w:left="283"/>
+      </w:pPr>
+      <w:r>
+        <w:rPr>
+          <w:rFonts w:ascii="Consolas" w:hAnsi="Consolas"/>
+          <w:color w:val="3730A3"/>
+          <w:sz w:val="19"/>
+        </w:rPr>
+        <w:t>create policy "orders: billing lock" on orders</w:t>
+        <w:br/>
+        <w:t xml:space="preserve">  as restrictive for insert</w:t>
+        <w:br/>
+        <w:t xml:space="preserve">  with check (not is_resto_billing_locked(resto_id));</w:t>
+      </w:r>
+    </w:p>
+    <w:p>
+      <w:pPr>
+        <w:shd w:val="clear" w:fill="FFF7E6"/>
+        <w:pBdr>
+          <w:left w:val="single" w:sz="18" w:space="6" w:color="F59E0B"/>
+        </w:pBdr>
+        <w:spacing w:before="120"/>
+        <w:ind w:left="227"/>
+      </w:pPr>
+      <w:r>
+        <w:rPr>
+          <w:b/>
+          <w:sz w:val="20"/>
+        </w:rPr>
+        <w:t>Restrictive, bukan permissive — dan itu bukan detail.</w:t>
+      </w:r>
+      <w:r>
+        <w:rPr>
+          <w:sz w:val="20"/>
+        </w:rPr>
+        <w:t xml:space="preserve"> Kebijakan permissive digabung dengan </w:t>
+      </w:r>
+      <w:r>
+        <w:rPr>
+          <w:b/>
+          <w:sz w:val="20"/>
+        </w:rPr>
+        <w:t>OR</w:t>
+      </w:r>
+      <w:r>
+        <w:rPr>
+          <w:sz w:val="20"/>
+        </w:rPr>
+        <w:t xml:space="preserve">: menambah satu lagi justru </w:t>
+      </w:r>
+      <w:r>
+        <w:rPr>
+          <w:i/>
+          <w:sz w:val="20"/>
+        </w:rPr>
+        <w:t>melonggarkan</w:t>
+      </w:r>
+      <w:r>
+        <w:rPr>
+          <w:sz w:val="20"/>
+        </w:rPr>
+        <w:t xml:space="preserve"> aksesnya, dan kunci yang dipasang begitu tidak mengunci apa pun. Yang restrictive digabung dengan </w:t>
+      </w:r>
+      <w:r>
+        <w:rPr>
+          <w:b/>
+          <w:sz w:val="20"/>
+        </w:rPr>
+        <w:t>AND</w:t>
+      </w:r>
+      <w:r>
+        <w:rPr>
+          <w:sz w:val="20"/>
+        </w:rPr>
+        <w:t>, dan itulah satu-satunya bentuk yang benar-benar menutup pintu tanpa menyentuh kebijakan yang sudah ada.</w:t>
+      </w:r>
+    </w:p>
+    <w:p>
+      <w:r>
+        <w:rPr>
+          <w:rFonts w:ascii="Consolas" w:hAnsi="Consolas"/>
+          <w:color w:val="3730A3"/>
+          <w:sz w:val="21"/>
+        </w:rPr>
+        <w:t>BillingGate</w:t>
+      </w:r>
+      <w:r>
+        <w:rPr>
+          <w:sz w:val="21"/>
+        </w:rPr>
+        <w:t xml:space="preserve"> di aplikasi tidak menegakkan apa pun — ia menerjemahkan keadaan yang sama jadi sesuatu yang bisa dibaca orang. Keduanya membaca </w:t>
+      </w:r>
+      <w:r>
+        <w:rPr>
+          <w:rFonts w:ascii="Consolas" w:hAnsi="Consolas"/>
+          <w:color w:val="3730A3"/>
+          <w:sz w:val="21"/>
+        </w:rPr>
+        <w:t>resto_billing_state()</w:t>
+      </w:r>
+      <w:r>
+        <w:rPr>
+          <w:sz w:val="21"/>
+        </w:rPr>
+        <w:t>, satu fungsi yang sama. Kalau keduanya sampai berbeda pendapat, yang menang database, dan gejalanya adalah tombol yang bisa ditekan tapi tidak menyimpan apa pun.</w:t>
+      </w:r>
+    </w:p>
+    <w:p>
+      <w:pPr>
+        <w:pStyle w:val="Heading2"/>
+      </w:pPr>
+      <w:r>
+        <w:t>Yang sengaja tidak dikunci</w:t>
+      </w:r>
+    </w:p>
+    <w:tbl>
+      <w:tblPr>
+        <w:tblStyle w:val="TableGrid"/>
+        <w:tblW w:type="auto" w:w="0"/>
+        <w:tblLayout w:type="autofit"/>
+        <w:tblLook w:firstColumn="1" w:firstRow="1" w:lastColumn="0" w:lastRow="0" w:noHBand="0" w:noVBand="1" w:val="04A0"/>
+      </w:tblPr>
+      <w:tblGrid>
+        <w:gridCol w:w="4929"/>
+        <w:gridCol w:w="4929"/>
+      </w:tblGrid>
+      <w:tr>
+        <w:trPr>
+          <w:tblHeader w:val="true"/>
+        </w:trPr>
+        <w:tc>
+          <w:tcPr>
+            <w:tcW w:type="dxa" w:w="4929"/>
+            <w:shd w:val="clear" w:fill="4F46E5"/>
+          </w:tcPr>
+          <w:p>
+            <w:pPr>
+              <w:spacing w:after="40" w:before="40"/>
+            </w:pPr>
+            <w:r>
+              <w:rPr>
+                <w:b/>
+                <w:color w:val="FFFFFF"/>
+                <w:sz w:val="19"/>
+              </w:rPr>
+              <w:t>Tetap terbuka</w:t>
+            </w:r>
+          </w:p>
+        </w:tc>
+        <w:tc>
+          <w:tcPr>
+            <w:tcW w:type="dxa" w:w="4929"/>
+            <w:shd w:val="clear" w:fill="4F46E5"/>
+          </w:tcPr>
+          <w:p>
+            <w:pPr>
+              <w:spacing w:after="40" w:before="40"/>
+            </w:pPr>
+            <w:r>
+              <w:rPr>
+                <w:b/>
+                <w:color w:val="FFFFFF"/>
+                <w:sz w:val="19"/>
+              </w:rPr>
+              <w:t>Kenapa</w:t>
+            </w:r>
+          </w:p>
+        </w:tc>
+      </w:tr>
+      <w:tr>
+        <w:tc>
+          <w:tcPr>
+            <w:tcW w:type="dxa" w:w="4929"/>
+          </w:tcPr>
+          <w:p>
+            <w:pPr>
+              <w:spacing w:after="40" w:before="40"/>
+            </w:pPr>
+            <w:r>
+              <w:rPr>
+                <w:sz w:val="19"/>
+              </w:rPr>
+              <w:t>Membaca tagihan sendiri</w:t>
+            </w:r>
+          </w:p>
+        </w:tc>
+        <w:tc>
+          <w:tcPr>
+            <w:tcW w:type="dxa" w:w="4929"/>
+          </w:tcPr>
+          <w:p>
+            <w:pPr>
+              <w:spacing w:after="40" w:before="40"/>
+            </w:pPr>
+            <w:r>
+              <w:rPr>
+                <w:sz w:val="19"/>
+              </w:rPr>
+              <w:t>Orang berhak tahu berapa yang ditagihkan kepadanya</w:t>
+            </w:r>
+          </w:p>
+        </w:tc>
+      </w:tr>
+      <w:tr>
+        <w:tc>
+          <w:tcPr>
+            <w:tcW w:type="dxa" w:w="4929"/>
+            <w:shd w:val="clear" w:fill="F4F5FB"/>
+          </w:tcPr>
+          <w:p>
+            <w:pPr>
+              <w:spacing w:after="40" w:before="40"/>
+            </w:pPr>
+            <w:r>
+              <w:rPr>
+                <w:sz w:val="19"/>
+              </w:rPr>
+              <w:t>Mengunggah bukti bayar</w:t>
+            </w:r>
+          </w:p>
+        </w:tc>
+        <w:tc>
+          <w:tcPr>
+            <w:tcW w:type="dxa" w:w="4929"/>
+            <w:shd w:val="clear" w:fill="F4F5FB"/>
+          </w:tcPr>
+          <w:p>
+            <w:pPr>
+              <w:spacing w:after="40" w:before="40"/>
+            </w:pPr>
+            <w:r>
+              <w:rPr>
+                <w:sz w:val="19"/>
+              </w:rPr>
+              <w:t>Inilah satu-satunya jalan keluar dari penguncian</w:t>
+            </w:r>
+          </w:p>
+        </w:tc>
+      </w:tr>
+      <w:tr>
+        <w:tc>
+          <w:tcPr>
+            <w:tcW w:type="dxa" w:w="4929"/>
+          </w:tcPr>
+          <w:p>
+            <w:pPr>
+              <w:spacing w:after="40" w:before="40"/>
+            </w:pPr>
+            <w:r>
+              <w:rPr>
+                <w:sz w:val="19"/>
+              </w:rPr>
+              <w:t>Keluar akun</w:t>
+            </w:r>
+          </w:p>
+        </w:tc>
+        <w:tc>
+          <w:tcPr>
+            <w:tcW w:type="dxa" w:w="4929"/>
+          </w:tcPr>
+          <w:p>
+            <w:pPr>
+              <w:spacing w:after="40" w:before="40"/>
+            </w:pPr>
+            <w:r>
+              <w:rPr>
+                <w:sz w:val="19"/>
+              </w:rPr>
+              <w:t>Perangkat yang dipinjam tidak boleh tersangkut di layar terkunci</w:t>
+            </w:r>
+          </w:p>
+        </w:tc>
+      </w:tr>
+      <w:tr>
+        <w:tc>
+          <w:tcPr>
+            <w:tcW w:type="dxa" w:w="4929"/>
+            <w:shd w:val="clear" w:fill="F4F5FB"/>
+          </w:tcPr>
+          <w:p>
+            <w:pPr>
+              <w:spacing w:after="40" w:before="40"/>
+            </w:pPr>
+            <w:r>
+              <w:rPr>
+                <w:sz w:val="19"/>
+              </w:rPr>
+              <w:t>Seluruh layar Super Admin</w:t>
+            </w:r>
+          </w:p>
+        </w:tc>
+        <w:tc>
+          <w:tcPr>
+            <w:tcW w:type="dxa" w:w="4929"/>
+            <w:shd w:val="clear" w:fill="F4F5FB"/>
+          </w:tcPr>
+          <w:p>
+            <w:pPr>
+              <w:spacing w:after="40" w:before="40"/>
+            </w:pPr>
+            <w:r>
+              <w:rPr>
+                <w:sz w:val="19"/>
+              </w:rPr>
+              <w:t>Dialah yang membuka kuncinya</w:t>
+            </w:r>
+          </w:p>
+        </w:tc>
+      </w:tr>
+    </w:tbl>
+    <w:p>
+      <w:pPr>
+        <w:pStyle w:val="Heading2"/>
+      </w:pPr>
+      <w:r>
+        <w:t>Alurnya</w:t>
+      </w:r>
+    </w:p>
+    <w:p>
+      <w:pPr>
+        <w:shd w:val="clear" w:fill="F2F3F8"/>
+        <w:spacing w:before="80"/>
+        <w:ind w:left="283"/>
+      </w:pPr>
+      <w:r>
+        <w:rPr>
+          <w:rFonts w:ascii="Consolas" w:hAnsi="Consolas"/>
+          <w:color w:val="3730A3"/>
+          <w:sz w:val="19"/>
+        </w:rPr>
+        <w:t>pg_cron (harian) → generate_billing_invoices()</w:t>
+        <w:br/>
+        <w:t xml:space="preserve">                   terbit H-7 sebelum jatuh tempo</w:t>
+        <w:br/>
+        <w:t xml:space="preserve">                            ↓</w:t>
+        <w:br/>
+        <w:t xml:space="preserve">        H-3: BillingGate menampilkan pita pengingat</w:t>
+        <w:br/>
+        <w:t xml:space="preserve">                            ↓</w:t>
+        <w:br/>
+        <w:t xml:space="preserve">   resto → submit_billing_payment()  → status 'review'</w:t>
+        <w:br/>
+        <w:t xml:space="preserve">                            ↓            (penguncian tertahan)</w:t>
+        <w:br/>
+        <w:t xml:space="preserve">   Super Admin → review_billing_payment(accept)</w:t>
+        <w:br/>
+        <w:t xml:space="preserve">                            ↓</w:t>
+        <w:br/>
+        <w:t xml:space="preserve">                      status 'paid'</w:t>
+      </w:r>
+    </w:p>
+    <w:p>
+      <w:r>
+        <w:rPr>
+          <w:sz w:val="21"/>
+        </w:rPr>
+        <w:t xml:space="preserve">Resto menaikkan status lewat RPC, bukan </w:t>
+      </w:r>
+      <w:r>
+        <w:rPr>
+          <w:rFonts w:ascii="Consolas" w:hAnsi="Consolas"/>
+          <w:color w:val="3730A3"/>
+          <w:sz w:val="21"/>
+        </w:rPr>
+        <w:t>UPDATE</w:t>
+      </w:r>
+      <w:r>
+        <w:rPr>
+          <w:sz w:val="21"/>
+        </w:rPr>
+        <w:t xml:space="preserve"> langsung. Kalau langsung, tidak ada yang mencegahnya menulis </w:t>
+      </w:r>
+      <w:r>
+        <w:rPr>
+          <w:rFonts w:ascii="Consolas" w:hAnsi="Consolas"/>
+          <w:color w:val="3730A3"/>
+          <w:sz w:val="21"/>
+        </w:rPr>
+        <w:t>paid</w:t>
+      </w:r>
+      <w:r>
+        <w:rPr>
+          <w:sz w:val="21"/>
+        </w:rPr>
+        <w:t xml:space="preserve"> untuk dirinya sendiri — dan </w:t>
+      </w:r>
+      <w:r>
+        <w:rPr>
+          <w:rFonts w:ascii="Consolas" w:hAnsi="Consolas"/>
+          <w:color w:val="3730A3"/>
+          <w:sz w:val="21"/>
+        </w:rPr>
+        <w:t>submit_billing_payment</w:t>
+      </w:r>
+      <w:r>
+        <w:rPr>
+          <w:sz w:val="21"/>
+        </w:rPr>
+        <w:t xml:space="preserve"> secara sengaja hanya bisa menulis </w:t>
+      </w:r>
+      <w:r>
+        <w:rPr>
+          <w:rFonts w:ascii="Consolas" w:hAnsi="Consolas"/>
+          <w:color w:val="3730A3"/>
+          <w:sz w:val="21"/>
+        </w:rPr>
+        <w:t>review</w:t>
+      </w:r>
+      <w:r>
+        <w:rPr>
+          <w:sz w:val="21"/>
+        </w:rPr>
+        <w:t>.</w:t>
       </w:r>
     </w:p>
     <w:p>

</xml_diff>

<commit_message>
Rilis 1.46.0, dan hapus resto (soft delete) untuk Super Admin
1.46.0: billing langganan, Virtual Account Xendit, dan Finance KaataGo.

Soft delete: `delete from restaurants` akan bekerja — dan membawa serta
seluruh isinya, karena hampir semua tabel menggantung padanya dengan
on delete cascade. Termasuk jurnal GL. Itu bukan yang dimaksud orang
saat menghapus resto dari daftar.

Yang terhapus benar-benar berhenti, bukan sekadar disembunyikan:
pelanggan yang memindai QR meja yang masih tertempel akan tetap sampai
ke menunya kalau penjagaannya cuma di daftar. Dipasang RESTRICTIVE di
orders dan products.

Berhenti ditagih bulan depan; tagihan yang sudah terbit dibiarkan — itu
utang yang benar-benar pernah ada.

Yang dikembalikan tidak langsung ikut aktif: resto itu belum tentu siap
melayani, dan menyalakannya diam-diam berarti pelanggan bisa memesan
sebelum ada yang memeriksa menunya.

Co-Authored-By: Claude Opus 5 <noreply@anthropic.com>
</commit_message>
<xml_diff>
--- a/docs/TSD-KAATAGO.docx
+++ b/docs/TSD-KAATAGO.docx
@@ -142,7 +142,7 @@
               <w:rPr>
                 <w:sz w:val="20"/>
               </w:rPr>
-              <w:t>1.45.4 (build 92)</w:t>
+              <w:t>1.46.0 (build 93)</w:t>
             </w:r>
           </w:p>
         </w:tc>
@@ -11462,7 +11462,7 @@
           <w:i/>
           <w:sz w:val="21"/>
         </w:rPr>
-        <w:t>Dokumen ini disusun dari kode aplikasi versi 1.45.4. Sisi fungsionalnya — peran, proses bisnis, aturan, dan tangkapan layar tiap peran — ada di `FSD-KAATAGO`.</w:t>
+        <w:t>Dokumen ini disusun dari kode aplikasi versi 1.46.0. Sisi fungsionalnya — peran, proses bisnis, aturan, dan tangkapan layar tiap peran — ada di `FSD-KAATAGO`.</w:t>
       </w:r>
     </w:p>
     <w:sectPr>
@@ -11586,7 +11586,7 @@
         <w:color w:val="6E728C"/>
         <w:sz w:val="17"/>
       </w:rPr>
-      <w:t>KaataGo — Technical Specification Document  |  v1.45.4</w:t>
+      <w:t>KaataGo — Technical Specification Document  |  v1.46.0</w:t>
     </w:r>
   </w:p>
 </w:hdr>

</xml_diff>

<commit_message>
Pendapatan langganan dicatat sebesar harga daftar, bukan sesudah potongan
Pemicunya mengkredit nominal yang SUDAH dipotong diskon lalu mendebit
diskonnya sekali lagi. Tagihan 230.000 berdiskon 50% menghasilkan
pendapatan bersih NOL, padahal 115.000 benar-benar masuk — potongannya
terhitung dua kali.

Yang benar: kredit 230.000, debit 115.000, bersih 115.000. Selain
angkanya benar, harga daftar dan besar potongan jadi dua angka yang
bisa dibaca terpisah.

Jurnal yang terlanjur salah diperbaiki dengan MENAMBAH baris koreksi,
bukan menyunting yang lama. Pembukuan yang barisnya bisa disunting
belakangan tidak bisa dipakai membuktikan apa pun.

Co-Authored-By: Claude Opus 5 <noreply@anthropic.com>
</commit_message>
<xml_diff>
--- a/docs/TSD-KAATAGO.docx
+++ b/docs/TSD-KAATAGO.docx
@@ -9441,6 +9441,255 @@
           <w:sz w:val="21"/>
         </w:rPr>
         <w:t>Menyaringnya di repository, bukan di layar, berarti layar baru yang dibuat nanti tidak bisa lupa menyaringnya.</w:t>
+      </w:r>
+    </w:p>
+    <w:p>
+      <w:r>
+        <w:rPr>
+          <w:b/>
+          <w:sz w:val="21"/>
+        </w:rPr>
+        <w:t>Pendapatan dicatat sebesar harga daftar, bukan sesudah potongan.</w:t>
+      </w:r>
+    </w:p>
+    <w:tbl>
+      <w:tblPr>
+        <w:tblStyle w:val="TableGrid"/>
+        <w:tblW w:type="auto" w:w="0"/>
+        <w:tblLayout w:type="autofit"/>
+        <w:tblLook w:firstColumn="1" w:firstRow="1" w:lastColumn="0" w:lastRow="0" w:noHBand="0" w:noVBand="1" w:val="04A0"/>
+      </w:tblPr>
+      <w:tblGrid>
+        <w:gridCol w:w="2465"/>
+        <w:gridCol w:w="2465"/>
+        <w:gridCol w:w="2465"/>
+        <w:gridCol w:w="2465"/>
+      </w:tblGrid>
+      <w:tr>
+        <w:trPr>
+          <w:tblHeader w:val="true"/>
+        </w:trPr>
+        <w:tc>
+          <w:tcPr>
+            <w:tcW w:type="dxa" w:w="2465"/>
+            <w:shd w:val="clear" w:fill="4F46E5"/>
+          </w:tcPr>
+          <w:p>
+            <w:pPr>
+              <w:spacing w:after="40" w:before="40"/>
+            </w:pPr>
+            <w:r>
+              <w:rPr>
+                <w:b/>
+                <w:color w:val="FFFFFF"/>
+                <w:sz w:val="19"/>
+              </w:rPr>
+            </w:r>
+          </w:p>
+        </w:tc>
+        <w:tc>
+          <w:tcPr>
+            <w:tcW w:type="dxa" w:w="2465"/>
+            <w:shd w:val="clear" w:fill="4F46E5"/>
+          </w:tcPr>
+          <w:p>
+            <w:pPr>
+              <w:spacing w:after="40" w:before="40"/>
+            </w:pPr>
+            <w:r>
+              <w:rPr>
+                <w:b/>
+                <w:color w:val="FFFFFF"/>
+                <w:sz w:val="19"/>
+              </w:rPr>
+              <w:t>Kredit Pendapatan</w:t>
+            </w:r>
+          </w:p>
+        </w:tc>
+        <w:tc>
+          <w:tcPr>
+            <w:tcW w:type="dxa" w:w="2465"/>
+            <w:shd w:val="clear" w:fill="4F46E5"/>
+          </w:tcPr>
+          <w:p>
+            <w:pPr>
+              <w:spacing w:after="40" w:before="40"/>
+            </w:pPr>
+            <w:r>
+              <w:rPr>
+                <w:b/>
+                <w:color w:val="FFFFFF"/>
+                <w:sz w:val="19"/>
+              </w:rPr>
+              <w:t>Debit Diskon</w:t>
+            </w:r>
+          </w:p>
+        </w:tc>
+        <w:tc>
+          <w:tcPr>
+            <w:tcW w:type="dxa" w:w="2465"/>
+            <w:shd w:val="clear" w:fill="4F46E5"/>
+          </w:tcPr>
+          <w:p>
+            <w:pPr>
+              <w:spacing w:after="40" w:before="40"/>
+            </w:pPr>
+            <w:r>
+              <w:rPr>
+                <w:b/>
+                <w:color w:val="FFFFFF"/>
+                <w:sz w:val="19"/>
+              </w:rPr>
+              <w:t>Bersih</w:t>
+            </w:r>
+          </w:p>
+        </w:tc>
+      </w:tr>
+      <w:tr>
+        <w:tc>
+          <w:tcPr>
+            <w:tcW w:type="dxa" w:w="2465"/>
+          </w:tcPr>
+          <w:p>
+            <w:pPr>
+              <w:spacing w:after="40" w:before="40"/>
+            </w:pPr>
+            <w:r>
+              <w:rPr>
+                <w:sz w:val="19"/>
+              </w:rPr>
+              <w:t>Salah</w:t>
+            </w:r>
+          </w:p>
+        </w:tc>
+        <w:tc>
+          <w:tcPr>
+            <w:tcW w:type="dxa" w:w="2465"/>
+          </w:tcPr>
+          <w:p>
+            <w:pPr>
+              <w:spacing w:after="40" w:before="40"/>
+            </w:pPr>
+            <w:r>
+              <w:rPr>
+                <w:sz w:val="19"/>
+              </w:rPr>
+              <w:t>115.000 (sudah dipotong)</w:t>
+            </w:r>
+          </w:p>
+        </w:tc>
+        <w:tc>
+          <w:tcPr>
+            <w:tcW w:type="dxa" w:w="2465"/>
+          </w:tcPr>
+          <w:p>
+            <w:pPr>
+              <w:spacing w:after="40" w:before="40"/>
+            </w:pPr>
+            <w:r>
+              <w:rPr>
+                <w:sz w:val="19"/>
+              </w:rPr>
+              <w:t>115.000</w:t>
+            </w:r>
+          </w:p>
+        </w:tc>
+        <w:tc>
+          <w:tcPr>
+            <w:tcW w:type="dxa" w:w="2465"/>
+          </w:tcPr>
+          <w:p>
+            <w:pPr>
+              <w:spacing w:after="40" w:before="40"/>
+            </w:pPr>
+            <w:r>
+              <w:rPr>
+                <w:b/>
+                <w:sz w:val="19"/>
+              </w:rPr>
+              <w:t>0</w:t>
+            </w:r>
+          </w:p>
+        </w:tc>
+      </w:tr>
+      <w:tr>
+        <w:tc>
+          <w:tcPr>
+            <w:tcW w:type="dxa" w:w="2465"/>
+            <w:shd w:val="clear" w:fill="F4F5FB"/>
+          </w:tcPr>
+          <w:p>
+            <w:pPr>
+              <w:spacing w:after="40" w:before="40"/>
+            </w:pPr>
+            <w:r>
+              <w:rPr>
+                <w:sz w:val="19"/>
+              </w:rPr>
+              <w:t>Benar</w:t>
+            </w:r>
+          </w:p>
+        </w:tc>
+        <w:tc>
+          <w:tcPr>
+            <w:tcW w:type="dxa" w:w="2465"/>
+            <w:shd w:val="clear" w:fill="F4F5FB"/>
+          </w:tcPr>
+          <w:p>
+            <w:pPr>
+              <w:spacing w:after="40" w:before="40"/>
+            </w:pPr>
+            <w:r>
+              <w:rPr>
+                <w:sz w:val="19"/>
+              </w:rPr>
+              <w:t>230.000 (harga daftar)</w:t>
+            </w:r>
+          </w:p>
+        </w:tc>
+        <w:tc>
+          <w:tcPr>
+            <w:tcW w:type="dxa" w:w="2465"/>
+            <w:shd w:val="clear" w:fill="F4F5FB"/>
+          </w:tcPr>
+          <w:p>
+            <w:pPr>
+              <w:spacing w:after="40" w:before="40"/>
+            </w:pPr>
+            <w:r>
+              <w:rPr>
+                <w:sz w:val="19"/>
+              </w:rPr>
+              <w:t>115.000</w:t>
+            </w:r>
+          </w:p>
+        </w:tc>
+        <w:tc>
+          <w:tcPr>
+            <w:tcW w:type="dxa" w:w="2465"/>
+            <w:shd w:val="clear" w:fill="F4F5FB"/>
+          </w:tcPr>
+          <w:p>
+            <w:pPr>
+              <w:spacing w:after="40" w:before="40"/>
+            </w:pPr>
+            <w:r>
+              <w:rPr>
+                <w:b/>
+                <w:sz w:val="19"/>
+              </w:rPr>
+              <w:t>115.000</w:t>
+            </w:r>
+          </w:p>
+        </w:tc>
+      </w:tr>
+    </w:tbl>
+    <w:p>
+      <w:r>
+        <w:rPr>
+          <w:sz w:val="21"/>
+        </w:rPr>
+        <w:t>Mengkredit nominal yang sudah dipotong lalu mendebit diskonnya menghitung potongan itu dua kali. Selain angka bersihnya salah, cara yang benar memberi dua angka yang bisa dibaca terpisah: berapa harga daftar yang kita jual, dan berapa yang kita berikan sebagai potongan. Pertanyaan "berapa besar diskon kita tahun ini" jadi punya jawabannya sendiri, bukan angka yang harus dikira-kira dari selisih.</w:t>
       </w:r>
     </w:p>
     <w:p>

</xml_diff>

<commit_message>
Rilis 1.46.2, dan dokumen menyusul temuannya
FSD bertambah 10 kebutuhan untuk Jurnal Semua Resto dan GL Diskon.

TSD 11.1b mencatat pelajarannya: dua layar yang membaca data sama harus
menyebut angka sama. Bentuk kegagalan itu sulit dilihat dari kodenya —
keduanya benar sendiri-sendiri, yang salah cuma kesepakatan di
antaranya, dan yang menemukannya adalah orang yang kebetulan
membandingkan dua angka yang seharusnya cocok.

Batas 1.000 baris pada jurnal lintas resto dicatat sebagai utang
teknis: belum masalah pada 200 baris, tapi kalau terlewati angkanya
akan kurang tanpa terlihat kurang — persis bentuk kesalahan yang baru
saja diperbaiki.

Test case jadi 323 kasus.

Co-Authored-By: Claude Opus 5 <noreply@anthropic.com>
</commit_message>
<xml_diff>
--- a/docs/TSD-KAATAGO.docx
+++ b/docs/TSD-KAATAGO.docx
@@ -142,7 +142,7 @@
               <w:rPr>
                 <w:sz w:val="20"/>
               </w:rPr>
-              <w:t>1.46.1 (build 94)</w:t>
+              <w:t>1.46.2 (build 95)</w:t>
             </w:r>
           </w:p>
         </w:tc>
@@ -10680,6 +10680,64 @@
         <w:pStyle w:val="Heading2"/>
       </w:pPr>
       <w:r>
+        <w:t>11.1b Dua layar yang membaca data sama harus menyebut angka sama</w:t>
+      </w:r>
+    </w:p>
+    <w:p>
+      <w:r>
+        <w:rPr>
+          <w:sz w:val="21"/>
+        </w:rPr>
+        <w:t xml:space="preserve">Jurnal GL per resto mengeluarkan baris pembatalan dari totalnya; layar Jurnal Semua Resto semula tidak. Selisihnya muncul </w:t>
+      </w:r>
+      <w:r>
+        <w:rPr>
+          <w:b/>
+          <w:sz w:val="21"/>
+        </w:rPr>
+        <w:t>persis sama di sisi debit dan kredit</w:t>
+      </w:r>
+      <w:r>
+        <w:rPr>
+          <w:sz w:val="21"/>
+        </w:rPr>
+        <w:t xml:space="preserve"> — karena pembatalan memang cermin dari baris yang dibatalkannya, jadi menghitungnya menaikkan keduanya sekaligus.</w:t>
+      </w:r>
+    </w:p>
+    <w:p>
+      <w:r>
+        <w:rPr>
+          <w:sz w:val="21"/>
+        </w:rPr>
+        <w:t>Bentuk kegagalan ini sulit dilihat dari kodenya: dua layar itu benar sendiri-sendiri, dan yang salah cuma kesepakatan di antara keduanya. Yang menemukannya adalah orang yang kebetulan membandingkan dua angka yang seharusnya sama.</w:t>
+      </w:r>
+    </w:p>
+    <w:p>
+      <w:r>
+        <w:rPr>
+          <w:sz w:val="21"/>
+        </w:rPr>
+        <w:t xml:space="preserve">Aturannya sekarang dikunci tes yang membaca </w:t>
+      </w:r>
+      <w:r>
+        <w:rPr>
+          <w:b/>
+          <w:sz w:val="21"/>
+        </w:rPr>
+        <w:t>kedua berkas layar sekaligus</w:t>
+      </w:r>
+      <w:r>
+        <w:rPr>
+          <w:sz w:val="21"/>
+        </w:rPr>
+        <w:t xml:space="preserve"> dan menuntut keduanya memakai kunci pasangan yang sama.</w:t>
+      </w:r>
+    </w:p>
+    <w:p>
+      <w:pPr>
+        <w:pStyle w:val="Heading2"/>
+      </w:pPr>
+      <w:r>
         <w:t>11.2 Mengubah tipe kembalian fungsi butuh DROP lebih dulu</w:t>
       </w:r>
     </w:p>
@@ -11665,7 +11723,7 @@
               <w:rPr>
                 <w:sz w:val="19"/>
               </w:rPr>
-              <w:t>Unduhan besar</w:t>
+              <w:t>Jurnal lintas resto dibatasi 1.000 baris</w:t>
             </w:r>
           </w:p>
         </w:tc>
@@ -11682,7 +11740,7 @@
               <w:rPr>
                 <w:sz w:val="19"/>
               </w:rPr>
-              <w:t>Bisa terhenti</w:t>
+              <w:t>Tidak ada penanda saat terpotong</w:t>
             </w:r>
           </w:p>
         </w:tc>
@@ -11690,6 +11748,56 @@
           <w:tcPr>
             <w:tcW w:type="dxa" w:w="3286"/>
             <w:shd w:val="clear" w:fill="F4F5FB"/>
+          </w:tcPr>
+          <w:p>
+            <w:pPr>
+              <w:spacing w:after="40" w:before="40"/>
+            </w:pPr>
+            <w:r>
+              <w:rPr>
+                <w:sz w:val="19"/>
+              </w:rPr>
+              <w:t>Angka bisa kurang tanpa terlihat kalau data melewati batas itu</w:t>
+            </w:r>
+          </w:p>
+        </w:tc>
+      </w:tr>
+      <w:tr>
+        <w:tc>
+          <w:tcPr>
+            <w:tcW w:type="dxa" w:w="3286"/>
+          </w:tcPr>
+          <w:p>
+            <w:pPr>
+              <w:spacing w:after="40" w:before="40"/>
+            </w:pPr>
+            <w:r>
+              <w:rPr>
+                <w:sz w:val="19"/>
+              </w:rPr>
+              <w:t>Unduhan besar</w:t>
+            </w:r>
+          </w:p>
+        </w:tc>
+        <w:tc>
+          <w:tcPr>
+            <w:tcW w:type="dxa" w:w="3286"/>
+          </w:tcPr>
+          <w:p>
+            <w:pPr>
+              <w:spacing w:after="40" w:before="40"/>
+            </w:pPr>
+            <w:r>
+              <w:rPr>
+                <w:sz w:val="19"/>
+              </w:rPr>
+              <w:t>Bisa terhenti</w:t>
+            </w:r>
+          </w:p>
+        </w:tc>
+        <w:tc>
+          <w:tcPr>
+            <w:tcW w:type="dxa" w:w="3286"/>
           </w:tcPr>
           <w:p>
             <w:pPr>
@@ -11711,7 +11819,7 @@
           <w:i/>
           <w:sz w:val="21"/>
         </w:rPr>
-        <w:t>Dokumen ini disusun dari kode aplikasi versi 1.46.1. Sisi fungsionalnya — peran, proses bisnis, aturan, dan tangkapan layar tiap peran — ada di `FSD-KAATAGO`.</w:t>
+        <w:t>Dokumen ini disusun dari kode aplikasi versi 1.46.2. Sisi fungsionalnya — peran, proses bisnis, aturan, dan tangkapan layar tiap peran — ada di `FSD-KAATAGO`.</w:t>
       </w:r>
     </w:p>
     <w:sectPr>
@@ -11835,7 +11943,7 @@
         <w:color w:val="6E728C"/>
         <w:sz w:val="17"/>
       </w:rPr>
-      <w:t>KaataGo — Technical Specification Document  |  v1.46.1</w:t>
+      <w:t>KaataGo — Technical Specification Document  |  v1.46.2</w:t>
     </w:r>
   </w:p>
 </w:hdr>

</xml_diff>

<commit_message>
Jurnal Semua Resto hanya resto klien, dan renumber tanpa tabel sementara
Pembukuan KaataGo disaring keluar. Barisnya memang tersimpan di tabel
yang sama, tapi mencampurnya membuat total debit/kredit menjumlahkan
dua pembukuan yang tidak punya hubungan: penjualan resto, dan tagihan
yang kami terbitkan kepada mereka.

Disaring di kueri, bukan sesudah data sampai — baris platform yang ikut
terangkut memakan jatah batas 1.000 baris, dan yang terpotong justru
jurnal resto yang dicari.

Tabel sementara di berkas renumber diganti daftar sebaris: ia hanya
hidup di satu sesi, dan SQL Editor Supabase bisa menjalankan tiap
pernyataan lewat koneksi berbeda. Galatnya lalu muncul di pernyataan
KEDUA, bukan pada yang membuat tabelnya — jadi yang membacanya
menyangka UPDATE-nya yang salah.

Co-Authored-By: Claude Opus 5 <noreply@anthropic.com>
</commit_message>
<xml_diff>
--- a/docs/TSD-KAATAGO.docx
+++ b/docs/TSD-KAATAGO.docx
@@ -9761,6 +9761,21 @@
           <w:sz w:val="21"/>
         </w:rPr>
         <w:t>.</w:t>
+      </w:r>
+    </w:p>
+    <w:p>
+      <w:r>
+        <w:rPr>
+          <w:b/>
+          <w:sz w:val="21"/>
+        </w:rPr>
+        <w:t>Jurnal Semua Resto menyaring keluar penyewa platform.</w:t>
+      </w:r>
+      <w:r>
+        <w:rPr>
+          <w:sz w:val="21"/>
+        </w:rPr>
+        <w:t xml:space="preserve"> Barisnya memang tersimpan di tabel yang sama, tapi mencampurnya di satu layar membuat total debit/kredit menjumlahkan dua pembukuan yang tidak punya hubungan satu sama lain: penjualan resto, dan tagihan yang kami terbitkan kepada mereka. Disaring di kuerinya, bukan sesudah data sampai — baris platform yang ikut terangkut memakan jatah batas 1.000 baris, dan yang terpotong justru jurnal resto yang dicari.</w:t>
       </w:r>
     </w:p>
     <w:p>

</xml_diff>

<commit_message>
Rilis 2.1.0 — halaman awal tiap peran jadi enam pintu
Nomor mayor dinaikkan karena yang berubah adalah cara orang menemukan
menunya, bukan isi menunya. Owner turun dari 19 menu jadi tiga kelompok
dan tiga menu berdiri sendiri; peran lain mengikuti bentuk yang sama.

Co-Authored-By: Claude Opus 5 <noreply@anthropic.com>
</commit_message>
<xml_diff>
--- a/docs/TSD-KAATAGO.docx
+++ b/docs/TSD-KAATAGO.docx
@@ -142,7 +142,7 @@
               <w:rPr>
                 <w:sz w:val="20"/>
               </w:rPr>
-              <w:t>1.46.3 (build 96)</w:t>
+              <w:t>2.1.0 (build 97)</w:t>
             </w:r>
           </w:p>
         </w:tc>
@@ -11834,7 +11834,7 @@
           <w:i/>
           <w:sz w:val="21"/>
         </w:rPr>
-        <w:t>Dokumen ini disusun dari kode aplikasi versi 1.46.3. Sisi fungsionalnya — peran, proses bisnis, aturan, dan tangkapan layar tiap peran — ada di `FSD-KAATAGO`.</w:t>
+        <w:t>Dokumen ini disusun dari kode aplikasi versi 2.1.0. Sisi fungsionalnya — peran, proses bisnis, aturan, dan tangkapan layar tiap peran — ada di `FSD-KAATAGO`.</w:t>
       </w:r>
     </w:p>
     <w:sectPr>
@@ -11958,7 +11958,7 @@
         <w:color w:val="6E728C"/>
         <w:sz w:val="17"/>
       </w:rPr>
-      <w:t>KaataGo — Technical Specification Document  |  v1.46.3</w:t>
+      <w:t>KaataGo — Technical Specification Document  |  v2.1.0</w:t>
     </w:r>
   </w:p>
 </w:hdr>

</xml_diff>